<commit_message>
Doku, CSS für Home Page und Readme aktualisiert
</commit_message>
<xml_diff>
--- a/PA_Fotostudio_Doku.docx
+++ b/PA_Fotostudio_Doku.docx
@@ -175,7 +175,7 @@
           <w:b w:val="0"/>
           <w:bCs w:val="0"/>
           <w:color w:val="auto"/>
-          <w:lang w:eastAsia="de-CH"/>
+          <w:lang w:val="de-DE" w:eastAsia="de-DE"/>
         </w:rPr>
       </w:pPr>
       <w:r>
@@ -187,7 +187,7 @@
       <w:r>
         <w:fldChar w:fldCharType="separate"/>
       </w:r>
-      <w:hyperlink w:anchor="_Toc63926697" w:history="1">
+      <w:hyperlink w:anchor="_Toc110858255" w:history="1">
         <w:r>
           <w:rPr>
             <w:rStyle w:val="Hyperlink"/>
@@ -200,7 +200,7 @@
             <w:b w:val="0"/>
             <w:bCs w:val="0"/>
             <w:color w:val="auto"/>
-            <w:lang w:eastAsia="de-CH"/>
+            <w:lang w:val="de-DE" w:eastAsia="de-DE"/>
           </w:rPr>
           <w:tab/>
         </w:r>
@@ -226,7 +226,7 @@
           <w:rPr>
             <w:webHidden/>
           </w:rPr>
-          <w:instrText xml:space="preserve"> PAGEREF _Toc63926697 \h </w:instrText>
+          <w:instrText xml:space="preserve"> PAGEREF _Toc110858255 \h </w:instrText>
         </w:r>
         <w:r>
           <w:rPr>
@@ -260,10 +260,10 @@
           <w:rFonts w:eastAsiaTheme="minorEastAsia"/>
           <w:noProof/>
           <w:color w:val="auto"/>
-          <w:lang w:eastAsia="de-CH"/>
+          <w:lang w:val="de-DE" w:eastAsia="de-DE"/>
         </w:rPr>
       </w:pPr>
-      <w:hyperlink w:anchor="_Toc63926698" w:history="1">
+      <w:hyperlink w:anchor="_Toc110858256" w:history="1">
         <w:r>
           <w:rPr>
             <w:rStyle w:val="Hyperlink"/>
@@ -276,7 +276,7 @@
             <w:rFonts w:eastAsiaTheme="minorEastAsia"/>
             <w:noProof/>
             <w:color w:val="auto"/>
-            <w:lang w:eastAsia="de-CH"/>
+            <w:lang w:val="de-DE" w:eastAsia="de-DE"/>
           </w:rPr>
           <w:tab/>
         </w:r>
@@ -306,7 +306,7 @@
             <w:noProof/>
             <w:webHidden/>
           </w:rPr>
-          <w:instrText xml:space="preserve"> PAGEREF _Toc63926698 \h </w:instrText>
+          <w:instrText xml:space="preserve"> PAGEREF _Toc110858256 \h </w:instrText>
         </w:r>
         <w:r>
           <w:rPr>
@@ -344,10 +344,10 @@
           <w:rFonts w:eastAsiaTheme="minorEastAsia"/>
           <w:noProof/>
           <w:color w:val="auto"/>
-          <w:lang w:eastAsia="de-CH"/>
+          <w:lang w:val="de-DE" w:eastAsia="de-DE"/>
         </w:rPr>
       </w:pPr>
-      <w:hyperlink w:anchor="_Toc63926699" w:history="1">
+      <w:hyperlink w:anchor="_Toc110858257" w:history="1">
         <w:r>
           <w:rPr>
             <w:rStyle w:val="Hyperlink"/>
@@ -360,7 +360,7 @@
             <w:rFonts w:eastAsiaTheme="minorEastAsia"/>
             <w:noProof/>
             <w:color w:val="auto"/>
-            <w:lang w:eastAsia="de-CH"/>
+            <w:lang w:val="de-DE" w:eastAsia="de-DE"/>
           </w:rPr>
           <w:tab/>
         </w:r>
@@ -390,7 +390,7 @@
             <w:noProof/>
             <w:webHidden/>
           </w:rPr>
-          <w:instrText xml:space="preserve"> PAGEREF _Toc63926699 \h </w:instrText>
+          <w:instrText xml:space="preserve"> PAGEREF _Toc110858257 \h </w:instrText>
         </w:r>
         <w:r>
           <w:rPr>
@@ -428,10 +428,10 @@
           <w:rFonts w:eastAsiaTheme="minorEastAsia"/>
           <w:noProof/>
           <w:color w:val="auto"/>
-          <w:lang w:eastAsia="de-CH"/>
+          <w:lang w:val="de-DE" w:eastAsia="de-DE"/>
         </w:rPr>
       </w:pPr>
-      <w:hyperlink w:anchor="_Toc63926700" w:history="1">
+      <w:hyperlink w:anchor="_Toc110858258" w:history="1">
         <w:r>
           <w:rPr>
             <w:rStyle w:val="Hyperlink"/>
@@ -444,7 +444,7 @@
             <w:rFonts w:eastAsiaTheme="minorEastAsia"/>
             <w:noProof/>
             <w:color w:val="auto"/>
-            <w:lang w:eastAsia="de-CH"/>
+            <w:lang w:val="de-DE" w:eastAsia="de-DE"/>
           </w:rPr>
           <w:tab/>
         </w:r>
@@ -474,7 +474,7 @@
             <w:noProof/>
             <w:webHidden/>
           </w:rPr>
-          <w:instrText xml:space="preserve"> PAGEREF _Toc63926700 \h </w:instrText>
+          <w:instrText xml:space="preserve"> PAGEREF _Toc110858258 \h </w:instrText>
         </w:r>
         <w:r>
           <w:rPr>
@@ -512,10 +512,10 @@
           <w:rFonts w:eastAsiaTheme="minorEastAsia"/>
           <w:noProof/>
           <w:color w:val="auto"/>
-          <w:lang w:eastAsia="de-CH"/>
+          <w:lang w:val="de-DE" w:eastAsia="de-DE"/>
         </w:rPr>
       </w:pPr>
-      <w:hyperlink w:anchor="_Toc63926701" w:history="1">
+      <w:hyperlink w:anchor="_Toc110858259" w:history="1">
         <w:r>
           <w:rPr>
             <w:rStyle w:val="Hyperlink"/>
@@ -528,7 +528,7 @@
             <w:rFonts w:eastAsiaTheme="minorEastAsia"/>
             <w:noProof/>
             <w:color w:val="auto"/>
-            <w:lang w:eastAsia="de-CH"/>
+            <w:lang w:val="de-DE" w:eastAsia="de-DE"/>
           </w:rPr>
           <w:tab/>
         </w:r>
@@ -558,7 +558,7 @@
             <w:noProof/>
             <w:webHidden/>
           </w:rPr>
-          <w:instrText xml:space="preserve"> PAGEREF _Toc63926701 \h </w:instrText>
+          <w:instrText xml:space="preserve"> PAGEREF _Toc110858259 \h </w:instrText>
         </w:r>
         <w:r>
           <w:rPr>
@@ -596,10 +596,10 @@
           <w:rFonts w:eastAsiaTheme="minorEastAsia"/>
           <w:noProof/>
           <w:color w:val="auto"/>
-          <w:lang w:eastAsia="de-CH"/>
+          <w:lang w:val="de-DE" w:eastAsia="de-DE"/>
         </w:rPr>
       </w:pPr>
-      <w:hyperlink w:anchor="_Toc63926702" w:history="1">
+      <w:hyperlink w:anchor="_Toc110858260" w:history="1">
         <w:r>
           <w:rPr>
             <w:rStyle w:val="Hyperlink"/>
@@ -612,7 +612,7 @@
             <w:rFonts w:eastAsiaTheme="minorEastAsia"/>
             <w:noProof/>
             <w:color w:val="auto"/>
-            <w:lang w:eastAsia="de-CH"/>
+            <w:lang w:val="de-DE" w:eastAsia="de-DE"/>
           </w:rPr>
           <w:tab/>
         </w:r>
@@ -642,7 +642,7 @@
             <w:noProof/>
             <w:webHidden/>
           </w:rPr>
-          <w:instrText xml:space="preserve"> PAGEREF _Toc63926702 \h </w:instrText>
+          <w:instrText xml:space="preserve"> PAGEREF _Toc110858260 \h </w:instrText>
         </w:r>
         <w:r>
           <w:rPr>
@@ -680,10 +680,10 @@
           <w:rFonts w:eastAsiaTheme="minorEastAsia"/>
           <w:noProof/>
           <w:color w:val="auto"/>
-          <w:lang w:eastAsia="de-CH"/>
+          <w:lang w:val="de-DE" w:eastAsia="de-DE"/>
         </w:rPr>
       </w:pPr>
-      <w:hyperlink w:anchor="_Toc63926703" w:history="1">
+      <w:hyperlink w:anchor="_Toc110858261" w:history="1">
         <w:r>
           <w:rPr>
             <w:rStyle w:val="Hyperlink"/>
@@ -696,7 +696,7 @@
             <w:rFonts w:eastAsiaTheme="minorEastAsia"/>
             <w:noProof/>
             <w:color w:val="auto"/>
-            <w:lang w:eastAsia="de-CH"/>
+            <w:lang w:val="de-DE" w:eastAsia="de-DE"/>
           </w:rPr>
           <w:tab/>
         </w:r>
@@ -726,7 +726,7 @@
             <w:noProof/>
             <w:webHidden/>
           </w:rPr>
-          <w:instrText xml:space="preserve"> PAGEREF _Toc63926703 \h </w:instrText>
+          <w:instrText xml:space="preserve"> PAGEREF _Toc110858261 \h </w:instrText>
         </w:r>
         <w:r>
           <w:rPr>
@@ -764,10 +764,10 @@
           <w:rFonts w:eastAsiaTheme="minorEastAsia"/>
           <w:noProof/>
           <w:color w:val="auto"/>
-          <w:lang w:eastAsia="de-CH"/>
+          <w:lang w:val="de-DE" w:eastAsia="de-DE"/>
         </w:rPr>
       </w:pPr>
-      <w:hyperlink w:anchor="_Toc63926704" w:history="1">
+      <w:hyperlink w:anchor="_Toc110858262" w:history="1">
         <w:r>
           <w:rPr>
             <w:rStyle w:val="Hyperlink"/>
@@ -780,7 +780,7 @@
             <w:rFonts w:eastAsiaTheme="minorEastAsia"/>
             <w:noProof/>
             <w:color w:val="auto"/>
-            <w:lang w:eastAsia="de-CH"/>
+            <w:lang w:val="de-DE" w:eastAsia="de-DE"/>
           </w:rPr>
           <w:tab/>
         </w:r>
@@ -810,7 +810,7 @@
             <w:noProof/>
             <w:webHidden/>
           </w:rPr>
-          <w:instrText xml:space="preserve"> PAGEREF _Toc63926704 \h </w:instrText>
+          <w:instrText xml:space="preserve"> PAGEREF _Toc110858262 \h </w:instrText>
         </w:r>
         <w:r>
           <w:rPr>
@@ -848,10 +848,10 @@
           <w:rFonts w:eastAsiaTheme="minorEastAsia"/>
           <w:noProof/>
           <w:color w:val="auto"/>
-          <w:lang w:eastAsia="de-CH"/>
+          <w:lang w:val="de-DE" w:eastAsia="de-DE"/>
         </w:rPr>
       </w:pPr>
-      <w:hyperlink w:anchor="_Toc63926705" w:history="1">
+      <w:hyperlink w:anchor="_Toc110858263" w:history="1">
         <w:r>
           <w:rPr>
             <w:rStyle w:val="Hyperlink"/>
@@ -864,7 +864,7 @@
             <w:rFonts w:eastAsiaTheme="minorEastAsia"/>
             <w:noProof/>
             <w:color w:val="auto"/>
-            <w:lang w:eastAsia="de-CH"/>
+            <w:lang w:val="de-DE" w:eastAsia="de-DE"/>
           </w:rPr>
           <w:tab/>
         </w:r>
@@ -894,7 +894,7 @@
             <w:noProof/>
             <w:webHidden/>
           </w:rPr>
-          <w:instrText xml:space="preserve"> PAGEREF _Toc63926705 \h </w:instrText>
+          <w:instrText xml:space="preserve"> PAGEREF _Toc110858263 \h </w:instrText>
         </w:r>
         <w:r>
           <w:rPr>
@@ -914,7 +914,7 @@
             <w:noProof/>
             <w:webHidden/>
           </w:rPr>
-          <w:t>2</w:t>
+          <w:t>3</w:t>
         </w:r>
         <w:r>
           <w:rPr>
@@ -932,10 +932,10 @@
           <w:rFonts w:eastAsiaTheme="minorEastAsia"/>
           <w:noProof/>
           <w:color w:val="auto"/>
-          <w:lang w:eastAsia="de-CH"/>
+          <w:lang w:val="de-DE" w:eastAsia="de-DE"/>
         </w:rPr>
       </w:pPr>
-      <w:hyperlink w:anchor="_Toc63926706" w:history="1">
+      <w:hyperlink w:anchor="_Toc110858264" w:history="1">
         <w:r>
           <w:rPr>
             <w:rStyle w:val="Hyperlink"/>
@@ -948,7 +948,7 @@
             <w:rFonts w:eastAsiaTheme="minorEastAsia"/>
             <w:noProof/>
             <w:color w:val="auto"/>
-            <w:lang w:eastAsia="de-CH"/>
+            <w:lang w:val="de-DE" w:eastAsia="de-DE"/>
           </w:rPr>
           <w:tab/>
         </w:r>
@@ -978,7 +978,7 @@
             <w:noProof/>
             <w:webHidden/>
           </w:rPr>
-          <w:instrText xml:space="preserve"> PAGEREF _Toc63926706 \h </w:instrText>
+          <w:instrText xml:space="preserve"> PAGEREF _Toc110858264 \h </w:instrText>
         </w:r>
         <w:r>
           <w:rPr>
@@ -998,7 +998,7 @@
             <w:noProof/>
             <w:webHidden/>
           </w:rPr>
-          <w:t>2</w:t>
+          <w:t>3</w:t>
         </w:r>
         <w:r>
           <w:rPr>
@@ -1016,10 +1016,10 @@
           <w:rFonts w:eastAsiaTheme="minorEastAsia"/>
           <w:noProof/>
           <w:color w:val="auto"/>
-          <w:lang w:eastAsia="de-CH"/>
+          <w:lang w:val="de-DE" w:eastAsia="de-DE"/>
         </w:rPr>
       </w:pPr>
-      <w:hyperlink w:anchor="_Toc63926707" w:history="1">
+      <w:hyperlink w:anchor="_Toc110858265" w:history="1">
         <w:r>
           <w:rPr>
             <w:rStyle w:val="Hyperlink"/>
@@ -1032,7 +1032,7 @@
             <w:rFonts w:eastAsiaTheme="minorEastAsia"/>
             <w:noProof/>
             <w:color w:val="auto"/>
-            <w:lang w:eastAsia="de-CH"/>
+            <w:lang w:val="de-DE" w:eastAsia="de-DE"/>
           </w:rPr>
           <w:tab/>
         </w:r>
@@ -1062,7 +1062,7 @@
             <w:noProof/>
             <w:webHidden/>
           </w:rPr>
-          <w:instrText xml:space="preserve"> PAGEREF _Toc63926707 \h </w:instrText>
+          <w:instrText xml:space="preserve"> PAGEREF _Toc110858265 \h </w:instrText>
         </w:r>
         <w:r>
           <w:rPr>
@@ -1082,7 +1082,7 @@
             <w:noProof/>
             <w:webHidden/>
           </w:rPr>
-          <w:t>3</w:t>
+          <w:t>4</w:t>
         </w:r>
         <w:r>
           <w:rPr>
@@ -1100,10 +1100,10 @@
           <w:rFonts w:eastAsiaTheme="minorEastAsia"/>
           <w:noProof/>
           <w:color w:val="auto"/>
-          <w:lang w:eastAsia="de-CH"/>
+          <w:lang w:val="de-DE" w:eastAsia="de-DE"/>
         </w:rPr>
       </w:pPr>
-      <w:hyperlink w:anchor="_Toc63926708" w:history="1">
+      <w:hyperlink w:anchor="_Toc110858266" w:history="1">
         <w:r>
           <w:rPr>
             <w:rStyle w:val="Hyperlink"/>
@@ -1116,7 +1116,7 @@
             <w:rFonts w:eastAsiaTheme="minorEastAsia"/>
             <w:noProof/>
             <w:color w:val="auto"/>
-            <w:lang w:eastAsia="de-CH"/>
+            <w:lang w:val="de-DE" w:eastAsia="de-DE"/>
           </w:rPr>
           <w:tab/>
         </w:r>
@@ -1146,7 +1146,7 @@
             <w:noProof/>
             <w:webHidden/>
           </w:rPr>
-          <w:instrText xml:space="preserve"> PAGEREF _Toc63926708 \h </w:instrText>
+          <w:instrText xml:space="preserve"> PAGEREF _Toc110858266 \h </w:instrText>
         </w:r>
         <w:r>
           <w:rPr>
@@ -1166,7 +1166,7 @@
             <w:noProof/>
             <w:webHidden/>
           </w:rPr>
-          <w:t>5</w:t>
+          <w:t>6</w:t>
         </w:r>
         <w:r>
           <w:rPr>
@@ -1184,10 +1184,10 @@
           <w:rFonts w:eastAsiaTheme="minorEastAsia"/>
           <w:noProof/>
           <w:color w:val="auto"/>
-          <w:lang w:eastAsia="de-CH"/>
+          <w:lang w:val="de-DE" w:eastAsia="de-DE"/>
         </w:rPr>
       </w:pPr>
-      <w:hyperlink w:anchor="_Toc63926709" w:history="1">
+      <w:hyperlink w:anchor="_Toc110858267" w:history="1">
         <w:r>
           <w:rPr>
             <w:rStyle w:val="Hyperlink"/>
@@ -1200,7 +1200,7 @@
             <w:rFonts w:eastAsiaTheme="minorEastAsia"/>
             <w:noProof/>
             <w:color w:val="auto"/>
-            <w:lang w:eastAsia="de-CH"/>
+            <w:lang w:val="de-DE" w:eastAsia="de-DE"/>
           </w:rPr>
           <w:tab/>
         </w:r>
@@ -1230,7 +1230,7 @@
             <w:noProof/>
             <w:webHidden/>
           </w:rPr>
-          <w:instrText xml:space="preserve"> PAGEREF _Toc63926709 \h </w:instrText>
+          <w:instrText xml:space="preserve"> PAGEREF _Toc110858267 \h </w:instrText>
         </w:r>
         <w:r>
           <w:rPr>
@@ -1250,7 +1250,7 @@
             <w:noProof/>
             <w:webHidden/>
           </w:rPr>
-          <w:t>5</w:t>
+          <w:t>6</w:t>
         </w:r>
         <w:r>
           <w:rPr>
@@ -1268,10 +1268,10 @@
           <w:rFonts w:eastAsiaTheme="minorEastAsia"/>
           <w:noProof/>
           <w:color w:val="auto"/>
-          <w:lang w:eastAsia="de-CH"/>
+          <w:lang w:val="de-DE" w:eastAsia="de-DE"/>
         </w:rPr>
       </w:pPr>
-      <w:hyperlink w:anchor="_Toc63926710" w:history="1">
+      <w:hyperlink w:anchor="_Toc110858268" w:history="1">
         <w:r>
           <w:rPr>
             <w:rStyle w:val="Hyperlink"/>
@@ -1284,7 +1284,7 @@
             <w:rFonts w:eastAsiaTheme="minorEastAsia"/>
             <w:noProof/>
             <w:color w:val="auto"/>
-            <w:lang w:eastAsia="de-CH"/>
+            <w:lang w:val="de-DE" w:eastAsia="de-DE"/>
           </w:rPr>
           <w:tab/>
         </w:r>
@@ -1293,7 +1293,7 @@
             <w:rStyle w:val="Hyperlink"/>
             <w:noProof/>
           </w:rPr>
-          <w:t>Tag 1: DD.MM.YYYY</w:t>
+          <w:t>Tag 1: 08.08.2022</w:t>
         </w:r>
         <w:r>
           <w:rPr>
@@ -1314,7 +1314,7 @@
             <w:noProof/>
             <w:webHidden/>
           </w:rPr>
-          <w:instrText xml:space="preserve"> PAGEREF _Toc63926710 \h </w:instrText>
+          <w:instrText xml:space="preserve"> PAGEREF _Toc110858268 \h </w:instrText>
         </w:r>
         <w:r>
           <w:rPr>
@@ -1334,7 +1334,7 @@
             <w:noProof/>
             <w:webHidden/>
           </w:rPr>
-          <w:t>5</w:t>
+          <w:t>6</w:t>
         </w:r>
         <w:r>
           <w:rPr>
@@ -1352,10 +1352,10 @@
           <w:rFonts w:eastAsiaTheme="minorEastAsia"/>
           <w:noProof/>
           <w:color w:val="auto"/>
-          <w:lang w:eastAsia="de-CH"/>
+          <w:lang w:val="de-DE" w:eastAsia="de-DE"/>
         </w:rPr>
       </w:pPr>
-      <w:hyperlink w:anchor="_Toc63926711" w:history="1">
+      <w:hyperlink w:anchor="_Toc110858269" w:history="1">
         <w:r>
           <w:rPr>
             <w:rStyle w:val="Hyperlink"/>
@@ -1368,7 +1368,7 @@
             <w:rFonts w:eastAsiaTheme="minorEastAsia"/>
             <w:noProof/>
             <w:color w:val="auto"/>
-            <w:lang w:eastAsia="de-CH"/>
+            <w:lang w:val="de-DE" w:eastAsia="de-DE"/>
           </w:rPr>
           <w:tab/>
         </w:r>
@@ -1377,7 +1377,7 @@
             <w:rStyle w:val="Hyperlink"/>
             <w:noProof/>
           </w:rPr>
-          <w:t>Tag 2: DD.MM.YYYY</w:t>
+          <w:t>Tag 2: 09.08.2022</w:t>
         </w:r>
         <w:r>
           <w:rPr>
@@ -1398,7 +1398,7 @@
             <w:noProof/>
             <w:webHidden/>
           </w:rPr>
-          <w:instrText xml:space="preserve"> PAGEREF _Toc63926711 \h </w:instrText>
+          <w:instrText xml:space="preserve"> PAGEREF _Toc110858269 \h </w:instrText>
         </w:r>
         <w:r>
           <w:rPr>
@@ -1418,7 +1418,7 @@
             <w:noProof/>
             <w:webHidden/>
           </w:rPr>
-          <w:t>5</w:t>
+          <w:t>6</w:t>
         </w:r>
         <w:r>
           <w:rPr>
@@ -1436,10 +1436,10 @@
           <w:rFonts w:eastAsiaTheme="minorEastAsia"/>
           <w:noProof/>
           <w:color w:val="auto"/>
-          <w:lang w:eastAsia="de-CH"/>
+          <w:lang w:val="de-DE" w:eastAsia="de-DE"/>
         </w:rPr>
       </w:pPr>
-      <w:hyperlink w:anchor="_Toc63926712" w:history="1">
+      <w:hyperlink w:anchor="_Toc110858270" w:history="1">
         <w:r>
           <w:rPr>
             <w:rStyle w:val="Hyperlink"/>
@@ -1452,7 +1452,7 @@
             <w:rFonts w:eastAsiaTheme="minorEastAsia"/>
             <w:noProof/>
             <w:color w:val="auto"/>
-            <w:lang w:eastAsia="de-CH"/>
+            <w:lang w:val="de-DE" w:eastAsia="de-DE"/>
           </w:rPr>
           <w:tab/>
         </w:r>
@@ -1461,7 +1461,7 @@
             <w:rStyle w:val="Hyperlink"/>
             <w:noProof/>
           </w:rPr>
-          <w:t>Tag 3: DD.MM.YYYY</w:t>
+          <w:t>Tag 3: 10.08.2022</w:t>
         </w:r>
         <w:r>
           <w:rPr>
@@ -1482,7 +1482,7 @@
             <w:noProof/>
             <w:webHidden/>
           </w:rPr>
-          <w:instrText xml:space="preserve"> PAGEREF _Toc63926712 \h </w:instrText>
+          <w:instrText xml:space="preserve"> PAGEREF _Toc110858270 \h </w:instrText>
         </w:r>
         <w:r>
           <w:rPr>
@@ -1502,7 +1502,7 @@
             <w:noProof/>
             <w:webHidden/>
           </w:rPr>
-          <w:t>5</w:t>
+          <w:t>7</w:t>
         </w:r>
         <w:r>
           <w:rPr>
@@ -1520,10 +1520,10 @@
           <w:rFonts w:eastAsiaTheme="minorEastAsia"/>
           <w:noProof/>
           <w:color w:val="auto"/>
-          <w:lang w:eastAsia="de-CH"/>
+          <w:lang w:val="de-DE" w:eastAsia="de-DE"/>
         </w:rPr>
       </w:pPr>
-      <w:hyperlink w:anchor="_Toc63926713" w:history="1">
+      <w:hyperlink w:anchor="_Toc110858271" w:history="1">
         <w:r>
           <w:rPr>
             <w:rStyle w:val="Hyperlink"/>
@@ -1536,7 +1536,7 @@
             <w:rFonts w:eastAsiaTheme="minorEastAsia"/>
             <w:noProof/>
             <w:color w:val="auto"/>
-            <w:lang w:eastAsia="de-CH"/>
+            <w:lang w:val="de-DE" w:eastAsia="de-DE"/>
           </w:rPr>
           <w:tab/>
         </w:r>
@@ -1545,7 +1545,7 @@
             <w:rStyle w:val="Hyperlink"/>
             <w:noProof/>
           </w:rPr>
-          <w:t>Tag 4: DD.MM.YYYY</w:t>
+          <w:t>Tag 4: 11.08.2022</w:t>
         </w:r>
         <w:r>
           <w:rPr>
@@ -1566,7 +1566,7 @@
             <w:noProof/>
             <w:webHidden/>
           </w:rPr>
-          <w:instrText xml:space="preserve"> PAGEREF _Toc63926713 \h </w:instrText>
+          <w:instrText xml:space="preserve"> PAGEREF _Toc110858271 \h </w:instrText>
         </w:r>
         <w:r>
           <w:rPr>
@@ -1586,7 +1586,7 @@
             <w:noProof/>
             <w:webHidden/>
           </w:rPr>
-          <w:t>6</w:t>
+          <w:t>7</w:t>
         </w:r>
         <w:r>
           <w:rPr>
@@ -1604,10 +1604,10 @@
           <w:rFonts w:eastAsiaTheme="minorEastAsia"/>
           <w:noProof/>
           <w:color w:val="auto"/>
-          <w:lang w:eastAsia="de-CH"/>
+          <w:lang w:val="de-DE" w:eastAsia="de-DE"/>
         </w:rPr>
       </w:pPr>
-      <w:hyperlink w:anchor="_Toc63926714" w:history="1">
+      <w:hyperlink w:anchor="_Toc110858272" w:history="1">
         <w:r>
           <w:rPr>
             <w:rStyle w:val="Hyperlink"/>
@@ -1620,7 +1620,7 @@
             <w:rFonts w:eastAsiaTheme="minorEastAsia"/>
             <w:noProof/>
             <w:color w:val="auto"/>
-            <w:lang w:eastAsia="de-CH"/>
+            <w:lang w:val="de-DE" w:eastAsia="de-DE"/>
           </w:rPr>
           <w:tab/>
         </w:r>
@@ -1629,7 +1629,7 @@
             <w:rStyle w:val="Hyperlink"/>
             <w:noProof/>
           </w:rPr>
-          <w:t>Tag 5: DD.MM.YYYY</w:t>
+          <w:t>Tag 5: 12.08.2022</w:t>
         </w:r>
         <w:r>
           <w:rPr>
@@ -1650,7 +1650,7 @@
             <w:noProof/>
             <w:webHidden/>
           </w:rPr>
-          <w:instrText xml:space="preserve"> PAGEREF _Toc63926714 \h </w:instrText>
+          <w:instrText xml:space="preserve"> PAGEREF _Toc110858272 \h </w:instrText>
         </w:r>
         <w:r>
           <w:rPr>
@@ -1670,7 +1670,7 @@
             <w:noProof/>
             <w:webHidden/>
           </w:rPr>
-          <w:t>6</w:t>
+          <w:t>7</w:t>
         </w:r>
         <w:r>
           <w:rPr>
@@ -1688,10 +1688,10 @@
           <w:rFonts w:eastAsiaTheme="minorEastAsia"/>
           <w:noProof/>
           <w:color w:val="auto"/>
-          <w:lang w:eastAsia="de-CH"/>
+          <w:lang w:val="de-DE" w:eastAsia="de-DE"/>
         </w:rPr>
       </w:pPr>
-      <w:hyperlink w:anchor="_Toc63926715" w:history="1">
+      <w:hyperlink w:anchor="_Toc110858273" w:history="1">
         <w:r>
           <w:rPr>
             <w:rStyle w:val="Hyperlink"/>
@@ -1704,7 +1704,7 @@
             <w:rFonts w:eastAsiaTheme="minorEastAsia"/>
             <w:noProof/>
             <w:color w:val="auto"/>
-            <w:lang w:eastAsia="de-CH"/>
+            <w:lang w:val="de-DE" w:eastAsia="de-DE"/>
           </w:rPr>
           <w:tab/>
         </w:r>
@@ -1713,7 +1713,7 @@
             <w:rStyle w:val="Hyperlink"/>
             <w:noProof/>
           </w:rPr>
-          <w:t>Tag 6: DD.MM.YYYY</w:t>
+          <w:t>Tag 6: 16.08.2022</w:t>
         </w:r>
         <w:r>
           <w:rPr>
@@ -1734,7 +1734,7 @@
             <w:noProof/>
             <w:webHidden/>
           </w:rPr>
-          <w:instrText xml:space="preserve"> PAGEREF _Toc63926715 \h </w:instrText>
+          <w:instrText xml:space="preserve"> PAGEREF _Toc110858273 \h </w:instrText>
         </w:r>
         <w:r>
           <w:rPr>
@@ -1754,7 +1754,7 @@
             <w:noProof/>
             <w:webHidden/>
           </w:rPr>
-          <w:t>6</w:t>
+          <w:t>8</w:t>
         </w:r>
         <w:r>
           <w:rPr>
@@ -1772,10 +1772,10 @@
           <w:rFonts w:eastAsiaTheme="minorEastAsia"/>
           <w:noProof/>
           <w:color w:val="auto"/>
-          <w:lang w:eastAsia="de-CH"/>
+          <w:lang w:val="de-DE" w:eastAsia="de-DE"/>
         </w:rPr>
       </w:pPr>
-      <w:hyperlink w:anchor="_Toc63926716" w:history="1">
+      <w:hyperlink w:anchor="_Toc110858274" w:history="1">
         <w:r>
           <w:rPr>
             <w:rStyle w:val="Hyperlink"/>
@@ -1788,7 +1788,7 @@
             <w:rFonts w:eastAsiaTheme="minorEastAsia"/>
             <w:noProof/>
             <w:color w:val="auto"/>
-            <w:lang w:eastAsia="de-CH"/>
+            <w:lang w:val="de-DE" w:eastAsia="de-DE"/>
           </w:rPr>
           <w:tab/>
         </w:r>
@@ -1797,7 +1797,7 @@
             <w:rStyle w:val="Hyperlink"/>
             <w:noProof/>
           </w:rPr>
-          <w:t>Tag 7: DD.MM.YYYY</w:t>
+          <w:t>Tag 7: 17.08.2022</w:t>
         </w:r>
         <w:r>
           <w:rPr>
@@ -1818,7 +1818,7 @@
             <w:noProof/>
             <w:webHidden/>
           </w:rPr>
-          <w:instrText xml:space="preserve"> PAGEREF _Toc63926716 \h </w:instrText>
+          <w:instrText xml:space="preserve"> PAGEREF _Toc110858274 \h </w:instrText>
         </w:r>
         <w:r>
           <w:rPr>
@@ -1838,7 +1838,7 @@
             <w:noProof/>
             <w:webHidden/>
           </w:rPr>
-          <w:t>6</w:t>
+          <w:t>8</w:t>
         </w:r>
         <w:r>
           <w:rPr>
@@ -1856,10 +1856,10 @@
           <w:rFonts w:eastAsiaTheme="minorEastAsia"/>
           <w:noProof/>
           <w:color w:val="auto"/>
-          <w:lang w:eastAsia="de-CH"/>
+          <w:lang w:val="de-DE" w:eastAsia="de-DE"/>
         </w:rPr>
       </w:pPr>
-      <w:hyperlink w:anchor="_Toc63926717" w:history="1">
+      <w:hyperlink w:anchor="_Toc110858275" w:history="1">
         <w:r>
           <w:rPr>
             <w:rStyle w:val="Hyperlink"/>
@@ -1872,7 +1872,7 @@
             <w:rFonts w:eastAsiaTheme="minorEastAsia"/>
             <w:noProof/>
             <w:color w:val="auto"/>
-            <w:lang w:eastAsia="de-CH"/>
+            <w:lang w:val="de-DE" w:eastAsia="de-DE"/>
           </w:rPr>
           <w:tab/>
         </w:r>
@@ -1881,7 +1881,7 @@
             <w:rStyle w:val="Hyperlink"/>
             <w:noProof/>
           </w:rPr>
-          <w:t>Tag 8: DD.MM.YYYY</w:t>
+          <w:t>Tag 8: 18.08.2022</w:t>
         </w:r>
         <w:r>
           <w:rPr>
@@ -1902,7 +1902,7 @@
             <w:noProof/>
             <w:webHidden/>
           </w:rPr>
-          <w:instrText xml:space="preserve"> PAGEREF _Toc63926717 \h </w:instrText>
+          <w:instrText xml:space="preserve"> PAGEREF _Toc110858275 \h </w:instrText>
         </w:r>
         <w:r>
           <w:rPr>
@@ -1922,7 +1922,7 @@
             <w:noProof/>
             <w:webHidden/>
           </w:rPr>
-          <w:t>6</w:t>
+          <w:t>8</w:t>
         </w:r>
         <w:r>
           <w:rPr>
@@ -1940,10 +1940,10 @@
           <w:rFonts w:eastAsiaTheme="minorEastAsia"/>
           <w:noProof/>
           <w:color w:val="auto"/>
-          <w:lang w:eastAsia="de-CH"/>
+          <w:lang w:val="de-DE" w:eastAsia="de-DE"/>
         </w:rPr>
       </w:pPr>
-      <w:hyperlink w:anchor="_Toc63926718" w:history="1">
+      <w:hyperlink w:anchor="_Toc110858276" w:history="1">
         <w:r>
           <w:rPr>
             <w:rStyle w:val="Hyperlink"/>
@@ -1956,7 +1956,7 @@
             <w:rFonts w:eastAsiaTheme="minorEastAsia"/>
             <w:noProof/>
             <w:color w:val="auto"/>
-            <w:lang w:eastAsia="de-CH"/>
+            <w:lang w:val="de-DE" w:eastAsia="de-DE"/>
           </w:rPr>
           <w:tab/>
         </w:r>
@@ -1965,7 +1965,7 @@
             <w:rStyle w:val="Hyperlink"/>
             <w:noProof/>
           </w:rPr>
-          <w:t>Tag 9: DD.MM.YYYY</w:t>
+          <w:t>Tag 9: 19.08.2022</w:t>
         </w:r>
         <w:r>
           <w:rPr>
@@ -1986,7 +1986,7 @@
             <w:noProof/>
             <w:webHidden/>
           </w:rPr>
-          <w:instrText xml:space="preserve"> PAGEREF _Toc63926718 \h </w:instrText>
+          <w:instrText xml:space="preserve"> PAGEREF _Toc110858276 \h </w:instrText>
         </w:r>
         <w:r>
           <w:rPr>
@@ -2006,7 +2006,7 @@
             <w:noProof/>
             <w:webHidden/>
           </w:rPr>
-          <w:t>6</w:t>
+          <w:t>9</w:t>
         </w:r>
         <w:r>
           <w:rPr>
@@ -2024,10 +2024,10 @@
           <w:rFonts w:eastAsiaTheme="minorEastAsia"/>
           <w:noProof/>
           <w:color w:val="auto"/>
-          <w:lang w:eastAsia="de-CH"/>
+          <w:lang w:val="de-DE" w:eastAsia="de-DE"/>
         </w:rPr>
       </w:pPr>
-      <w:hyperlink w:anchor="_Toc63926719" w:history="1">
+      <w:hyperlink w:anchor="_Toc110858277" w:history="1">
         <w:r>
           <w:rPr>
             <w:rStyle w:val="Hyperlink"/>
@@ -2040,7 +2040,7 @@
             <w:rFonts w:eastAsiaTheme="minorEastAsia"/>
             <w:noProof/>
             <w:color w:val="auto"/>
-            <w:lang w:eastAsia="de-CH"/>
+            <w:lang w:val="de-DE" w:eastAsia="de-DE"/>
           </w:rPr>
           <w:tab/>
         </w:r>
@@ -2049,7 +2049,7 @@
             <w:rStyle w:val="Hyperlink"/>
             <w:noProof/>
           </w:rPr>
-          <w:t>Tag 10: DD.MM.YYYY</w:t>
+          <w:t>Tag 10: 20.08.2022</w:t>
         </w:r>
         <w:r>
           <w:rPr>
@@ -2070,7 +2070,7 @@
             <w:noProof/>
             <w:webHidden/>
           </w:rPr>
-          <w:instrText xml:space="preserve"> PAGEREF _Toc63926719 \h </w:instrText>
+          <w:instrText xml:space="preserve"> PAGEREF _Toc110858277 \h </w:instrText>
         </w:r>
         <w:r>
           <w:rPr>
@@ -2090,7 +2090,7 @@
             <w:noProof/>
             <w:webHidden/>
           </w:rPr>
-          <w:t>6</w:t>
+          <w:t>9</w:t>
         </w:r>
         <w:r>
           <w:rPr>
@@ -2109,10 +2109,10 @@
           <w:b w:val="0"/>
           <w:bCs w:val="0"/>
           <w:color w:val="auto"/>
-          <w:lang w:eastAsia="de-CH"/>
+          <w:lang w:val="de-DE" w:eastAsia="de-DE"/>
         </w:rPr>
       </w:pPr>
-      <w:hyperlink w:anchor="_Toc63926720" w:history="1">
+      <w:hyperlink w:anchor="_Toc110858278" w:history="1">
         <w:r>
           <w:rPr>
             <w:rStyle w:val="Hyperlink"/>
@@ -2125,7 +2125,7 @@
             <w:b w:val="0"/>
             <w:bCs w:val="0"/>
             <w:color w:val="auto"/>
-            <w:lang w:eastAsia="de-CH"/>
+            <w:lang w:val="de-DE" w:eastAsia="de-DE"/>
           </w:rPr>
           <w:tab/>
         </w:r>
@@ -2151,7 +2151,7 @@
           <w:rPr>
             <w:webHidden/>
           </w:rPr>
-          <w:instrText xml:space="preserve"> PAGEREF _Toc63926720 \h </w:instrText>
+          <w:instrText xml:space="preserve"> PAGEREF _Toc110858278 \h </w:instrText>
         </w:r>
         <w:r>
           <w:rPr>
@@ -2168,7 +2168,7 @@
           <w:rPr>
             <w:webHidden/>
           </w:rPr>
-          <w:t>7</w:t>
+          <w:t>11</w:t>
         </w:r>
         <w:r>
           <w:rPr>
@@ -2185,10 +2185,10 @@
           <w:rFonts w:eastAsiaTheme="minorEastAsia"/>
           <w:noProof/>
           <w:color w:val="auto"/>
-          <w:lang w:eastAsia="de-CH"/>
+          <w:lang w:val="de-DE" w:eastAsia="de-DE"/>
         </w:rPr>
       </w:pPr>
-      <w:hyperlink w:anchor="_Toc63926721" w:history="1">
+      <w:hyperlink w:anchor="_Toc110858279" w:history="1">
         <w:r>
           <w:rPr>
             <w:rStyle w:val="Hyperlink"/>
@@ -2201,7 +2201,7 @@
             <w:rFonts w:eastAsiaTheme="minorEastAsia"/>
             <w:noProof/>
             <w:color w:val="auto"/>
-            <w:lang w:eastAsia="de-CH"/>
+            <w:lang w:val="de-DE" w:eastAsia="de-DE"/>
           </w:rPr>
           <w:tab/>
         </w:r>
@@ -2231,7 +2231,7 @@
             <w:noProof/>
             <w:webHidden/>
           </w:rPr>
-          <w:instrText xml:space="preserve"> PAGEREF _Toc63926721 \h </w:instrText>
+          <w:instrText xml:space="preserve"> PAGEREF _Toc110858279 \h </w:instrText>
         </w:r>
         <w:r>
           <w:rPr>
@@ -2251,7 +2251,7 @@
             <w:noProof/>
             <w:webHidden/>
           </w:rPr>
-          <w:t>7</w:t>
+          <w:t>11</w:t>
         </w:r>
         <w:r>
           <w:rPr>
@@ -2269,10 +2269,10 @@
           <w:rFonts w:eastAsiaTheme="minorEastAsia"/>
           <w:noProof/>
           <w:color w:val="auto"/>
-          <w:lang w:eastAsia="de-CH"/>
+          <w:lang w:val="de-DE" w:eastAsia="de-DE"/>
         </w:rPr>
       </w:pPr>
-      <w:hyperlink w:anchor="_Toc63926722" w:history="1">
+      <w:hyperlink w:anchor="_Toc110858280" w:history="1">
         <w:r>
           <w:rPr>
             <w:rStyle w:val="Hyperlink"/>
@@ -2285,7 +2285,7 @@
             <w:rFonts w:eastAsiaTheme="minorEastAsia"/>
             <w:noProof/>
             <w:color w:val="auto"/>
-            <w:lang w:eastAsia="de-CH"/>
+            <w:lang w:val="de-DE" w:eastAsia="de-DE"/>
           </w:rPr>
           <w:tab/>
         </w:r>
@@ -2315,7 +2315,7 @@
             <w:noProof/>
             <w:webHidden/>
           </w:rPr>
-          <w:instrText xml:space="preserve"> PAGEREF _Toc63926722 \h </w:instrText>
+          <w:instrText xml:space="preserve"> PAGEREF _Toc110858280 \h </w:instrText>
         </w:r>
         <w:r>
           <w:rPr>
@@ -2335,7 +2335,7 @@
             <w:noProof/>
             <w:webHidden/>
           </w:rPr>
-          <w:t>7</w:t>
+          <w:t>12</w:t>
         </w:r>
         <w:r>
           <w:rPr>
@@ -2353,10 +2353,10 @@
           <w:rFonts w:eastAsiaTheme="minorEastAsia"/>
           <w:noProof/>
           <w:color w:val="auto"/>
-          <w:lang w:eastAsia="de-CH"/>
+          <w:lang w:val="de-DE" w:eastAsia="de-DE"/>
         </w:rPr>
       </w:pPr>
-      <w:hyperlink w:anchor="_Toc63926723" w:history="1">
+      <w:hyperlink w:anchor="_Toc110858281" w:history="1">
         <w:r>
           <w:rPr>
             <w:rStyle w:val="Hyperlink"/>
@@ -2369,7 +2369,7 @@
             <w:rFonts w:eastAsiaTheme="minorEastAsia"/>
             <w:noProof/>
             <w:color w:val="auto"/>
-            <w:lang w:eastAsia="de-CH"/>
+            <w:lang w:val="de-DE" w:eastAsia="de-DE"/>
           </w:rPr>
           <w:tab/>
         </w:r>
@@ -2399,7 +2399,7 @@
             <w:noProof/>
             <w:webHidden/>
           </w:rPr>
-          <w:instrText xml:space="preserve"> PAGEREF _Toc63926723 \h </w:instrText>
+          <w:instrText xml:space="preserve"> PAGEREF _Toc110858281 \h </w:instrText>
         </w:r>
         <w:r>
           <w:rPr>
@@ -2419,7 +2419,7 @@
             <w:noProof/>
             <w:webHidden/>
           </w:rPr>
-          <w:t>7</w:t>
+          <w:t>12</w:t>
         </w:r>
         <w:r>
           <w:rPr>
@@ -2437,10 +2437,10 @@
           <w:rFonts w:eastAsiaTheme="minorEastAsia"/>
           <w:noProof/>
           <w:color w:val="auto"/>
-          <w:lang w:eastAsia="de-CH"/>
+          <w:lang w:val="de-DE" w:eastAsia="de-DE"/>
         </w:rPr>
       </w:pPr>
-      <w:hyperlink w:anchor="_Toc63926724" w:history="1">
+      <w:hyperlink w:anchor="_Toc110858282" w:history="1">
         <w:r>
           <w:rPr>
             <w:rStyle w:val="Hyperlink"/>
@@ -2453,7 +2453,7 @@
             <w:rFonts w:eastAsiaTheme="minorEastAsia"/>
             <w:noProof/>
             <w:color w:val="auto"/>
-            <w:lang w:eastAsia="de-CH"/>
+            <w:lang w:val="de-DE" w:eastAsia="de-DE"/>
           </w:rPr>
           <w:tab/>
         </w:r>
@@ -2483,7 +2483,7 @@
             <w:noProof/>
             <w:webHidden/>
           </w:rPr>
-          <w:instrText xml:space="preserve"> PAGEREF _Toc63926724 \h </w:instrText>
+          <w:instrText xml:space="preserve"> PAGEREF _Toc110858282 \h </w:instrText>
         </w:r>
         <w:r>
           <w:rPr>
@@ -2503,7 +2503,7 @@
             <w:noProof/>
             <w:webHidden/>
           </w:rPr>
-          <w:t>7</w:t>
+          <w:t>12</w:t>
         </w:r>
         <w:r>
           <w:rPr>
@@ -2521,10 +2521,10 @@
           <w:rFonts w:eastAsiaTheme="minorEastAsia"/>
           <w:noProof/>
           <w:color w:val="auto"/>
-          <w:lang w:eastAsia="de-CH"/>
+          <w:lang w:val="de-DE" w:eastAsia="de-DE"/>
         </w:rPr>
       </w:pPr>
-      <w:hyperlink w:anchor="_Toc63926725" w:history="1">
+      <w:hyperlink w:anchor="_Toc110858283" w:history="1">
         <w:r>
           <w:rPr>
             <w:rStyle w:val="Hyperlink"/>
@@ -2537,7 +2537,7 @@
             <w:rFonts w:eastAsiaTheme="minorEastAsia"/>
             <w:noProof/>
             <w:color w:val="auto"/>
-            <w:lang w:eastAsia="de-CH"/>
+            <w:lang w:val="de-DE" w:eastAsia="de-DE"/>
           </w:rPr>
           <w:tab/>
         </w:r>
@@ -2567,7 +2567,7 @@
             <w:noProof/>
             <w:webHidden/>
           </w:rPr>
-          <w:instrText xml:space="preserve"> PAGEREF _Toc63926725 \h </w:instrText>
+          <w:instrText xml:space="preserve"> PAGEREF _Toc110858283 \h </w:instrText>
         </w:r>
         <w:r>
           <w:rPr>
@@ -2587,7 +2587,7 @@
             <w:noProof/>
             <w:webHidden/>
           </w:rPr>
-          <w:t>7</w:t>
+          <w:t>13</w:t>
         </w:r>
         <w:r>
           <w:rPr>
@@ -2605,10 +2605,10 @@
           <w:rFonts w:eastAsiaTheme="minorEastAsia"/>
           <w:noProof/>
           <w:color w:val="auto"/>
-          <w:lang w:eastAsia="de-CH"/>
+          <w:lang w:val="de-DE" w:eastAsia="de-DE"/>
         </w:rPr>
       </w:pPr>
-      <w:hyperlink w:anchor="_Toc63926726" w:history="1">
+      <w:hyperlink w:anchor="_Toc110858284" w:history="1">
         <w:r>
           <w:rPr>
             <w:rStyle w:val="Hyperlink"/>
@@ -2621,7 +2621,7 @@
             <w:rFonts w:eastAsiaTheme="minorEastAsia"/>
             <w:noProof/>
             <w:color w:val="auto"/>
-            <w:lang w:eastAsia="de-CH"/>
+            <w:lang w:val="de-DE" w:eastAsia="de-DE"/>
           </w:rPr>
           <w:tab/>
         </w:r>
@@ -2651,7 +2651,7 @@
             <w:noProof/>
             <w:webHidden/>
           </w:rPr>
-          <w:instrText xml:space="preserve"> PAGEREF _Toc63926726 \h </w:instrText>
+          <w:instrText xml:space="preserve"> PAGEREF _Toc110858284 \h </w:instrText>
         </w:r>
         <w:r>
           <w:rPr>
@@ -2671,7 +2671,7 @@
             <w:noProof/>
             <w:webHidden/>
           </w:rPr>
-          <w:t>7</w:t>
+          <w:t>13</w:t>
         </w:r>
         <w:r>
           <w:rPr>
@@ -2689,10 +2689,10 @@
           <w:rFonts w:eastAsiaTheme="minorEastAsia"/>
           <w:noProof/>
           <w:color w:val="auto"/>
-          <w:lang w:eastAsia="de-CH"/>
+          <w:lang w:val="de-DE" w:eastAsia="de-DE"/>
         </w:rPr>
       </w:pPr>
-      <w:hyperlink w:anchor="_Toc63926727" w:history="1">
+      <w:hyperlink w:anchor="_Toc110858285" w:history="1">
         <w:r>
           <w:rPr>
             <w:rStyle w:val="Hyperlink"/>
@@ -2705,7 +2705,7 @@
             <w:rFonts w:eastAsiaTheme="minorEastAsia"/>
             <w:noProof/>
             <w:color w:val="auto"/>
-            <w:lang w:eastAsia="de-CH"/>
+            <w:lang w:val="de-DE" w:eastAsia="de-DE"/>
           </w:rPr>
           <w:tab/>
         </w:r>
@@ -2735,7 +2735,7 @@
             <w:noProof/>
             <w:webHidden/>
           </w:rPr>
-          <w:instrText xml:space="preserve"> PAGEREF _Toc63926727 \h </w:instrText>
+          <w:instrText xml:space="preserve"> PAGEREF _Toc110858285 \h </w:instrText>
         </w:r>
         <w:r>
           <w:rPr>
@@ -2755,7 +2755,7 @@
             <w:noProof/>
             <w:webHidden/>
           </w:rPr>
-          <w:t>7</w:t>
+          <w:t>13</w:t>
         </w:r>
         <w:r>
           <w:rPr>
@@ -2773,10 +2773,10 @@
           <w:rFonts w:eastAsiaTheme="minorEastAsia"/>
           <w:noProof/>
           <w:color w:val="auto"/>
-          <w:lang w:eastAsia="de-CH"/>
+          <w:lang w:val="de-DE" w:eastAsia="de-DE"/>
         </w:rPr>
       </w:pPr>
-      <w:hyperlink w:anchor="_Toc63926728" w:history="1">
+      <w:hyperlink w:anchor="_Toc110858286" w:history="1">
         <w:r>
           <w:rPr>
             <w:rStyle w:val="Hyperlink"/>
@@ -2789,7 +2789,7 @@
             <w:rFonts w:eastAsiaTheme="minorEastAsia"/>
             <w:noProof/>
             <w:color w:val="auto"/>
-            <w:lang w:eastAsia="de-CH"/>
+            <w:lang w:val="de-DE" w:eastAsia="de-DE"/>
           </w:rPr>
           <w:tab/>
         </w:r>
@@ -2819,7 +2819,7 @@
             <w:noProof/>
             <w:webHidden/>
           </w:rPr>
-          <w:instrText xml:space="preserve"> PAGEREF _Toc63926728 \h </w:instrText>
+          <w:instrText xml:space="preserve"> PAGEREF _Toc110858286 \h </w:instrText>
         </w:r>
         <w:r>
           <w:rPr>
@@ -2839,7 +2839,7 @@
             <w:noProof/>
             <w:webHidden/>
           </w:rPr>
-          <w:t>7</w:t>
+          <w:t>13</w:t>
         </w:r>
         <w:r>
           <w:rPr>
@@ -2857,10 +2857,10 @@
           <w:rFonts w:eastAsiaTheme="minorEastAsia"/>
           <w:noProof/>
           <w:color w:val="auto"/>
-          <w:lang w:eastAsia="de-CH"/>
+          <w:lang w:val="de-DE" w:eastAsia="de-DE"/>
         </w:rPr>
       </w:pPr>
-      <w:hyperlink w:anchor="_Toc63926729" w:history="1">
+      <w:hyperlink w:anchor="_Toc110858287" w:history="1">
         <w:r>
           <w:rPr>
             <w:rStyle w:val="Hyperlink"/>
@@ -2873,7 +2873,7 @@
             <w:rFonts w:eastAsiaTheme="minorEastAsia"/>
             <w:noProof/>
             <w:color w:val="auto"/>
-            <w:lang w:eastAsia="de-CH"/>
+            <w:lang w:val="de-DE" w:eastAsia="de-DE"/>
           </w:rPr>
           <w:tab/>
         </w:r>
@@ -2903,7 +2903,7 @@
             <w:noProof/>
             <w:webHidden/>
           </w:rPr>
-          <w:instrText xml:space="preserve"> PAGEREF _Toc63926729 \h </w:instrText>
+          <w:instrText xml:space="preserve"> PAGEREF _Toc110858287 \h </w:instrText>
         </w:r>
         <w:r>
           <w:rPr>
@@ -2923,7 +2923,7 @@
             <w:noProof/>
             <w:webHidden/>
           </w:rPr>
-          <w:t>7</w:t>
+          <w:t>13</w:t>
         </w:r>
         <w:r>
           <w:rPr>
@@ -2941,10 +2941,10 @@
           <w:rFonts w:eastAsiaTheme="minorEastAsia"/>
           <w:noProof/>
           <w:color w:val="auto"/>
-          <w:lang w:eastAsia="de-CH"/>
+          <w:lang w:val="de-DE" w:eastAsia="de-DE"/>
         </w:rPr>
       </w:pPr>
-      <w:hyperlink w:anchor="_Toc63926730" w:history="1">
+      <w:hyperlink w:anchor="_Toc110858288" w:history="1">
         <w:r>
           <w:rPr>
             <w:rStyle w:val="Hyperlink"/>
@@ -2957,7 +2957,7 @@
             <w:rFonts w:eastAsiaTheme="minorEastAsia"/>
             <w:noProof/>
             <w:color w:val="auto"/>
-            <w:lang w:eastAsia="de-CH"/>
+            <w:lang w:val="de-DE" w:eastAsia="de-DE"/>
           </w:rPr>
           <w:tab/>
         </w:r>
@@ -2987,7 +2987,7 @@
             <w:noProof/>
             <w:webHidden/>
           </w:rPr>
-          <w:instrText xml:space="preserve"> PAGEREF _Toc63926730 \h </w:instrText>
+          <w:instrText xml:space="preserve"> PAGEREF _Toc110858288 \h </w:instrText>
         </w:r>
         <w:r>
           <w:rPr>
@@ -3007,7 +3007,7 @@
             <w:noProof/>
             <w:webHidden/>
           </w:rPr>
-          <w:t>7</w:t>
+          <w:t>13</w:t>
         </w:r>
         <w:r>
           <w:rPr>
@@ -3025,10 +3025,10 @@
           <w:rFonts w:eastAsiaTheme="minorEastAsia"/>
           <w:noProof/>
           <w:color w:val="auto"/>
-          <w:lang w:eastAsia="de-CH"/>
+          <w:lang w:val="de-DE" w:eastAsia="de-DE"/>
         </w:rPr>
       </w:pPr>
-      <w:hyperlink w:anchor="_Toc63926731" w:history="1">
+      <w:hyperlink w:anchor="_Toc110858289" w:history="1">
         <w:r>
           <w:rPr>
             <w:rStyle w:val="Hyperlink"/>
@@ -3041,7 +3041,7 @@
             <w:rFonts w:eastAsiaTheme="minorEastAsia"/>
             <w:noProof/>
             <w:color w:val="auto"/>
-            <w:lang w:eastAsia="de-CH"/>
+            <w:lang w:val="de-DE" w:eastAsia="de-DE"/>
           </w:rPr>
           <w:tab/>
         </w:r>
@@ -3071,7 +3071,7 @@
             <w:noProof/>
             <w:webHidden/>
           </w:rPr>
-          <w:instrText xml:space="preserve"> PAGEREF _Toc63926731 \h </w:instrText>
+          <w:instrText xml:space="preserve"> PAGEREF _Toc110858289 \h </w:instrText>
         </w:r>
         <w:r>
           <w:rPr>
@@ -3091,7 +3091,7 @@
             <w:noProof/>
             <w:webHidden/>
           </w:rPr>
-          <w:t>8</w:t>
+          <w:t>13</w:t>
         </w:r>
         <w:r>
           <w:rPr>
@@ -3110,10 +3110,10 @@
           <w:b w:val="0"/>
           <w:bCs w:val="0"/>
           <w:color w:val="auto"/>
-          <w:lang w:eastAsia="de-CH"/>
+          <w:lang w:val="de-DE" w:eastAsia="de-DE"/>
         </w:rPr>
       </w:pPr>
-      <w:hyperlink w:anchor="_Toc63926732" w:history="1">
+      <w:hyperlink w:anchor="_Toc110858290" w:history="1">
         <w:r>
           <w:rPr>
             <w:rStyle w:val="Hyperlink"/>
@@ -3126,7 +3126,7 @@
             <w:b w:val="0"/>
             <w:bCs w:val="0"/>
             <w:color w:val="auto"/>
-            <w:lang w:eastAsia="de-CH"/>
+            <w:lang w:val="de-DE" w:eastAsia="de-DE"/>
           </w:rPr>
           <w:tab/>
         </w:r>
@@ -3152,7 +3152,7 @@
           <w:rPr>
             <w:webHidden/>
           </w:rPr>
-          <w:instrText xml:space="preserve"> PAGEREF _Toc63926732 \h </w:instrText>
+          <w:instrText xml:space="preserve"> PAGEREF _Toc110858290 \h </w:instrText>
         </w:r>
         <w:r>
           <w:rPr>
@@ -3169,7 +3169,7 @@
           <w:rPr>
             <w:webHidden/>
           </w:rPr>
-          <w:t>9</w:t>
+          <w:t>14</w:t>
         </w:r>
         <w:r>
           <w:rPr>
@@ -3186,10 +3186,10 @@
           <w:rFonts w:eastAsiaTheme="minorEastAsia"/>
           <w:noProof/>
           <w:color w:val="auto"/>
-          <w:lang w:eastAsia="de-CH"/>
+          <w:lang w:val="de-DE" w:eastAsia="de-DE"/>
         </w:rPr>
       </w:pPr>
-      <w:hyperlink w:anchor="_Toc63926733" w:history="1">
+      <w:hyperlink w:anchor="_Toc110858291" w:history="1">
         <w:r>
           <w:rPr>
             <w:rStyle w:val="Hyperlink"/>
@@ -3202,7 +3202,7 @@
             <w:rFonts w:eastAsiaTheme="minorEastAsia"/>
             <w:noProof/>
             <w:color w:val="auto"/>
-            <w:lang w:eastAsia="de-CH"/>
+            <w:lang w:val="de-DE" w:eastAsia="de-DE"/>
           </w:rPr>
           <w:tab/>
         </w:r>
@@ -3232,7 +3232,7 @@
             <w:noProof/>
             <w:webHidden/>
           </w:rPr>
-          <w:instrText xml:space="preserve"> PAGEREF _Toc63926733 \h </w:instrText>
+          <w:instrText xml:space="preserve"> PAGEREF _Toc110858291 \h </w:instrText>
         </w:r>
         <w:r>
           <w:rPr>
@@ -3252,7 +3252,7 @@
             <w:noProof/>
             <w:webHidden/>
           </w:rPr>
-          <w:t>9</w:t>
+          <w:t>14</w:t>
         </w:r>
         <w:r>
           <w:rPr>
@@ -3270,10 +3270,10 @@
           <w:rFonts w:eastAsiaTheme="minorEastAsia"/>
           <w:noProof/>
           <w:color w:val="auto"/>
-          <w:lang w:eastAsia="de-CH"/>
+          <w:lang w:val="de-DE" w:eastAsia="de-DE"/>
         </w:rPr>
       </w:pPr>
-      <w:hyperlink w:anchor="_Toc63926734" w:history="1">
+      <w:hyperlink w:anchor="_Toc110858292" w:history="1">
         <w:r>
           <w:rPr>
             <w:rStyle w:val="Hyperlink"/>
@@ -3286,7 +3286,7 @@
             <w:rFonts w:eastAsiaTheme="minorEastAsia"/>
             <w:noProof/>
             <w:color w:val="auto"/>
-            <w:lang w:eastAsia="de-CH"/>
+            <w:lang w:val="de-DE" w:eastAsia="de-DE"/>
           </w:rPr>
           <w:tab/>
         </w:r>
@@ -3316,7 +3316,7 @@
             <w:noProof/>
             <w:webHidden/>
           </w:rPr>
-          <w:instrText xml:space="preserve"> PAGEREF _Toc63926734 \h </w:instrText>
+          <w:instrText xml:space="preserve"> PAGEREF _Toc110858292 \h </w:instrText>
         </w:r>
         <w:r>
           <w:rPr>
@@ -3336,7 +3336,7 @@
             <w:noProof/>
             <w:webHidden/>
           </w:rPr>
-          <w:t>9</w:t>
+          <w:t>14</w:t>
         </w:r>
         <w:r>
           <w:rPr>
@@ -3354,10 +3354,10 @@
           <w:rFonts w:eastAsiaTheme="minorEastAsia"/>
           <w:noProof/>
           <w:color w:val="auto"/>
-          <w:lang w:eastAsia="de-CH"/>
+          <w:lang w:val="de-DE" w:eastAsia="de-DE"/>
         </w:rPr>
       </w:pPr>
-      <w:hyperlink w:anchor="_Toc63926735" w:history="1">
+      <w:hyperlink w:anchor="_Toc110858293" w:history="1">
         <w:r>
           <w:rPr>
             <w:rStyle w:val="Hyperlink"/>
@@ -3370,7 +3370,7 @@
             <w:rFonts w:eastAsiaTheme="minorEastAsia"/>
             <w:noProof/>
             <w:color w:val="auto"/>
-            <w:lang w:eastAsia="de-CH"/>
+            <w:lang w:val="de-DE" w:eastAsia="de-DE"/>
           </w:rPr>
           <w:tab/>
         </w:r>
@@ -3400,7 +3400,7 @@
             <w:noProof/>
             <w:webHidden/>
           </w:rPr>
-          <w:instrText xml:space="preserve"> PAGEREF _Toc63926735 \h </w:instrText>
+          <w:instrText xml:space="preserve"> PAGEREF _Toc110858293 \h </w:instrText>
         </w:r>
         <w:r>
           <w:rPr>
@@ -3420,7 +3420,7 @@
             <w:noProof/>
             <w:webHidden/>
           </w:rPr>
-          <w:t>9</w:t>
+          <w:t>14</w:t>
         </w:r>
         <w:r>
           <w:rPr>
@@ -3438,10 +3438,10 @@
           <w:rFonts w:eastAsiaTheme="minorEastAsia"/>
           <w:noProof/>
           <w:color w:val="auto"/>
-          <w:lang w:eastAsia="de-CH"/>
+          <w:lang w:val="de-DE" w:eastAsia="de-DE"/>
         </w:rPr>
       </w:pPr>
-      <w:hyperlink w:anchor="_Toc63926736" w:history="1">
+      <w:hyperlink w:anchor="_Toc110858294" w:history="1">
         <w:r>
           <w:rPr>
             <w:rStyle w:val="Hyperlink"/>
@@ -3454,7 +3454,7 @@
             <w:rFonts w:eastAsiaTheme="minorEastAsia"/>
             <w:noProof/>
             <w:color w:val="auto"/>
-            <w:lang w:eastAsia="de-CH"/>
+            <w:lang w:val="de-DE" w:eastAsia="de-DE"/>
           </w:rPr>
           <w:tab/>
         </w:r>
@@ -3484,7 +3484,7 @@
             <w:noProof/>
             <w:webHidden/>
           </w:rPr>
-          <w:instrText xml:space="preserve"> PAGEREF _Toc63926736 \h </w:instrText>
+          <w:instrText xml:space="preserve"> PAGEREF _Toc110858294 \h </w:instrText>
         </w:r>
         <w:r>
           <w:rPr>
@@ -3504,7 +3504,7 @@
             <w:noProof/>
             <w:webHidden/>
           </w:rPr>
-          <w:t>9</w:t>
+          <w:t>14</w:t>
         </w:r>
         <w:r>
           <w:rPr>
@@ -3522,10 +3522,10 @@
           <w:rFonts w:eastAsiaTheme="minorEastAsia"/>
           <w:noProof/>
           <w:color w:val="auto"/>
-          <w:lang w:eastAsia="de-CH"/>
+          <w:lang w:val="de-DE" w:eastAsia="de-DE"/>
         </w:rPr>
       </w:pPr>
-      <w:hyperlink w:anchor="_Toc63926737" w:history="1">
+      <w:hyperlink w:anchor="_Toc110858295" w:history="1">
         <w:r>
           <w:rPr>
             <w:rStyle w:val="Hyperlink"/>
@@ -3538,7 +3538,7 @@
             <w:rFonts w:eastAsiaTheme="minorEastAsia"/>
             <w:noProof/>
             <w:color w:val="auto"/>
-            <w:lang w:eastAsia="de-CH"/>
+            <w:lang w:val="de-DE" w:eastAsia="de-DE"/>
           </w:rPr>
           <w:tab/>
         </w:r>
@@ -3568,7 +3568,7 @@
             <w:noProof/>
             <w:webHidden/>
           </w:rPr>
-          <w:instrText xml:space="preserve"> PAGEREF _Toc63926737 \h </w:instrText>
+          <w:instrText xml:space="preserve"> PAGEREF _Toc110858295 \h </w:instrText>
         </w:r>
         <w:r>
           <w:rPr>
@@ -3588,7 +3588,7 @@
             <w:noProof/>
             <w:webHidden/>
           </w:rPr>
-          <w:t>9</w:t>
+          <w:t>14</w:t>
         </w:r>
         <w:r>
           <w:rPr>
@@ -3606,10 +3606,10 @@
           <w:rFonts w:eastAsiaTheme="minorEastAsia"/>
           <w:noProof/>
           <w:color w:val="auto"/>
-          <w:lang w:eastAsia="de-CH"/>
+          <w:lang w:val="de-DE" w:eastAsia="de-DE"/>
         </w:rPr>
       </w:pPr>
-      <w:hyperlink w:anchor="_Toc63926738" w:history="1">
+      <w:hyperlink w:anchor="_Toc110858296" w:history="1">
         <w:r>
           <w:rPr>
             <w:rStyle w:val="Hyperlink"/>
@@ -3622,7 +3622,7 @@
             <w:rFonts w:eastAsiaTheme="minorEastAsia"/>
             <w:noProof/>
             <w:color w:val="auto"/>
-            <w:lang w:eastAsia="de-CH"/>
+            <w:lang w:val="de-DE" w:eastAsia="de-DE"/>
           </w:rPr>
           <w:tab/>
         </w:r>
@@ -3652,7 +3652,7 @@
             <w:noProof/>
             <w:webHidden/>
           </w:rPr>
-          <w:instrText xml:space="preserve"> PAGEREF _Toc63926738 \h </w:instrText>
+          <w:instrText xml:space="preserve"> PAGEREF _Toc110858296 \h </w:instrText>
         </w:r>
         <w:r>
           <w:rPr>
@@ -3672,7 +3672,7 @@
             <w:noProof/>
             <w:webHidden/>
           </w:rPr>
-          <w:t>9</w:t>
+          <w:t>14</w:t>
         </w:r>
         <w:r>
           <w:rPr>
@@ -3690,10 +3690,10 @@
           <w:rFonts w:eastAsiaTheme="minorEastAsia"/>
           <w:noProof/>
           <w:color w:val="auto"/>
-          <w:lang w:eastAsia="de-CH"/>
+          <w:lang w:val="de-DE" w:eastAsia="de-DE"/>
         </w:rPr>
       </w:pPr>
-      <w:hyperlink w:anchor="_Toc63926739" w:history="1">
+      <w:hyperlink w:anchor="_Toc110858297" w:history="1">
         <w:r>
           <w:rPr>
             <w:rStyle w:val="Hyperlink"/>
@@ -3706,7 +3706,7 @@
             <w:rFonts w:eastAsiaTheme="minorEastAsia"/>
             <w:noProof/>
             <w:color w:val="auto"/>
-            <w:lang w:eastAsia="de-CH"/>
+            <w:lang w:val="de-DE" w:eastAsia="de-DE"/>
           </w:rPr>
           <w:tab/>
         </w:r>
@@ -3715,7 +3715,7 @@
             <w:rStyle w:val="Hyperlink"/>
             <w:noProof/>
           </w:rPr>
-          <w:t>Use Case</w:t>
+          <w:t>ERM</w:t>
         </w:r>
         <w:r>
           <w:rPr>
@@ -3736,7 +3736,7 @@
             <w:noProof/>
             <w:webHidden/>
           </w:rPr>
-          <w:instrText xml:space="preserve"> PAGEREF _Toc63926739 \h </w:instrText>
+          <w:instrText xml:space="preserve"> PAGEREF _Toc110858297 \h </w:instrText>
         </w:r>
         <w:r>
           <w:rPr>
@@ -3756,7 +3756,7 @@
             <w:noProof/>
             <w:webHidden/>
           </w:rPr>
-          <w:t>9</w:t>
+          <w:t>14</w:t>
         </w:r>
         <w:r>
           <w:rPr>
@@ -3774,10 +3774,10 @@
           <w:rFonts w:eastAsiaTheme="minorEastAsia"/>
           <w:noProof/>
           <w:color w:val="auto"/>
-          <w:lang w:eastAsia="de-CH"/>
+          <w:lang w:val="de-DE" w:eastAsia="de-DE"/>
         </w:rPr>
       </w:pPr>
-      <w:hyperlink w:anchor="_Toc63926740" w:history="1">
+      <w:hyperlink w:anchor="_Toc110858298" w:history="1">
         <w:r>
           <w:rPr>
             <w:rStyle w:val="Hyperlink"/>
@@ -3790,7 +3790,7 @@
             <w:rFonts w:eastAsiaTheme="minorEastAsia"/>
             <w:noProof/>
             <w:color w:val="auto"/>
-            <w:lang w:eastAsia="de-CH"/>
+            <w:lang w:val="de-DE" w:eastAsia="de-DE"/>
           </w:rPr>
           <w:tab/>
         </w:r>
@@ -3799,7 +3799,7 @@
             <w:rStyle w:val="Hyperlink"/>
             <w:noProof/>
           </w:rPr>
-          <w:t>ERM</w:t>
+          <w:t>Klassendiagramm</w:t>
         </w:r>
         <w:r>
           <w:rPr>
@@ -3820,7 +3820,7 @@
             <w:noProof/>
             <w:webHidden/>
           </w:rPr>
-          <w:instrText xml:space="preserve"> PAGEREF _Toc63926740 \h </w:instrText>
+          <w:instrText xml:space="preserve"> PAGEREF _Toc110858298 \h </w:instrText>
         </w:r>
         <w:r>
           <w:rPr>
@@ -3840,7 +3840,7 @@
             <w:noProof/>
             <w:webHidden/>
           </w:rPr>
-          <w:t>9</w:t>
+          <w:t>14</w:t>
         </w:r>
         <w:r>
           <w:rPr>
@@ -3858,10 +3858,10 @@
           <w:rFonts w:eastAsiaTheme="minorEastAsia"/>
           <w:noProof/>
           <w:color w:val="auto"/>
-          <w:lang w:eastAsia="de-CH"/>
+          <w:lang w:val="de-DE" w:eastAsia="de-DE"/>
         </w:rPr>
       </w:pPr>
-      <w:hyperlink w:anchor="_Toc63926741" w:history="1">
+      <w:hyperlink w:anchor="_Toc110858299" w:history="1">
         <w:r>
           <w:rPr>
             <w:rStyle w:val="Hyperlink"/>
@@ -3874,7 +3874,7 @@
             <w:rFonts w:eastAsiaTheme="minorEastAsia"/>
             <w:noProof/>
             <w:color w:val="auto"/>
-            <w:lang w:eastAsia="de-CH"/>
+            <w:lang w:val="de-DE" w:eastAsia="de-DE"/>
           </w:rPr>
           <w:tab/>
         </w:r>
@@ -3883,7 +3883,7 @@
             <w:rStyle w:val="Hyperlink"/>
             <w:noProof/>
           </w:rPr>
-          <w:t>Klassendiagramm</w:t>
+          <w:t>Mock-Ups</w:t>
         </w:r>
         <w:r>
           <w:rPr>
@@ -3904,7 +3904,7 @@
             <w:noProof/>
             <w:webHidden/>
           </w:rPr>
-          <w:instrText xml:space="preserve"> PAGEREF _Toc63926741 \h </w:instrText>
+          <w:instrText xml:space="preserve"> PAGEREF _Toc110858299 \h </w:instrText>
         </w:r>
         <w:r>
           <w:rPr>
@@ -3924,7 +3924,7 @@
             <w:noProof/>
             <w:webHidden/>
           </w:rPr>
-          <w:t>9</w:t>
+          <w:t>14</w:t>
         </w:r>
         <w:r>
           <w:rPr>
@@ -3942,10 +3942,10 @@
           <w:rFonts w:eastAsiaTheme="minorEastAsia"/>
           <w:noProof/>
           <w:color w:val="auto"/>
-          <w:lang w:eastAsia="de-CH"/>
+          <w:lang w:val="de-DE" w:eastAsia="de-DE"/>
         </w:rPr>
       </w:pPr>
-      <w:hyperlink w:anchor="_Toc63926742" w:history="1">
+      <w:hyperlink w:anchor="_Toc110858300" w:history="1">
         <w:r>
           <w:rPr>
             <w:rStyle w:val="Hyperlink"/>
@@ -3958,7 +3958,7 @@
             <w:rFonts w:eastAsiaTheme="minorEastAsia"/>
             <w:noProof/>
             <w:color w:val="auto"/>
-            <w:lang w:eastAsia="de-CH"/>
+            <w:lang w:val="de-DE" w:eastAsia="de-DE"/>
           </w:rPr>
           <w:tab/>
         </w:r>
@@ -3967,7 +3967,7 @@
             <w:rStyle w:val="Hyperlink"/>
             <w:noProof/>
           </w:rPr>
-          <w:t>Mock-Ups</w:t>
+          <w:t>Struktogramm</w:t>
         </w:r>
         <w:r>
           <w:rPr>
@@ -3988,7 +3988,7 @@
             <w:noProof/>
             <w:webHidden/>
           </w:rPr>
-          <w:instrText xml:space="preserve"> PAGEREF _Toc63926742 \h </w:instrText>
+          <w:instrText xml:space="preserve"> PAGEREF _Toc110858300 \h </w:instrText>
         </w:r>
         <w:r>
           <w:rPr>
@@ -4008,7 +4008,7 @@
             <w:noProof/>
             <w:webHidden/>
           </w:rPr>
-          <w:t>9</w:t>
+          <w:t>14</w:t>
         </w:r>
         <w:r>
           <w:rPr>
@@ -4026,10 +4026,10 @@
           <w:rFonts w:eastAsiaTheme="minorEastAsia"/>
           <w:noProof/>
           <w:color w:val="auto"/>
-          <w:lang w:eastAsia="de-CH"/>
+          <w:lang w:val="de-DE" w:eastAsia="de-DE"/>
         </w:rPr>
       </w:pPr>
-      <w:hyperlink w:anchor="_Toc63926743" w:history="1">
+      <w:hyperlink w:anchor="_Toc110858301" w:history="1">
         <w:r>
           <w:rPr>
             <w:rStyle w:val="Hyperlink"/>
@@ -4042,7 +4042,7 @@
             <w:rFonts w:eastAsiaTheme="minorEastAsia"/>
             <w:noProof/>
             <w:color w:val="auto"/>
-            <w:lang w:eastAsia="de-CH"/>
+            <w:lang w:val="de-DE" w:eastAsia="de-DE"/>
           </w:rPr>
           <w:tab/>
         </w:r>
@@ -4051,7 +4051,7 @@
             <w:rStyle w:val="Hyperlink"/>
             <w:noProof/>
           </w:rPr>
-          <w:t>Struktogramm</w:t>
+          <w:t>…?</w:t>
         </w:r>
         <w:r>
           <w:rPr>
@@ -4072,7 +4072,7 @@
             <w:noProof/>
             <w:webHidden/>
           </w:rPr>
-          <w:instrText xml:space="preserve"> PAGEREF _Toc63926743 \h </w:instrText>
+          <w:instrText xml:space="preserve"> PAGEREF _Toc110858301 \h </w:instrText>
         </w:r>
         <w:r>
           <w:rPr>
@@ -4092,91 +4092,7 @@
             <w:noProof/>
             <w:webHidden/>
           </w:rPr>
-          <w:t>9</w:t>
-        </w:r>
-        <w:r>
-          <w:rPr>
-            <w:noProof/>
-            <w:webHidden/>
-          </w:rPr>
-          <w:fldChar w:fldCharType="end"/>
-        </w:r>
-      </w:hyperlink>
-    </w:p>
-    <w:p>
-      <w:pPr>
-        <w:pStyle w:val="Verzeichnis3"/>
-        <w:rPr>
-          <w:rFonts w:eastAsiaTheme="minorEastAsia"/>
-          <w:noProof/>
-          <w:color w:val="auto"/>
-          <w:lang w:eastAsia="de-CH"/>
-        </w:rPr>
-      </w:pPr>
-      <w:hyperlink w:anchor="_Toc63926744" w:history="1">
-        <w:r>
-          <w:rPr>
-            <w:rStyle w:val="Hyperlink"/>
-            <w:noProof/>
-          </w:rPr>
-          <w:t>3.2.7</w:t>
-        </w:r>
-        <w:r>
-          <w:rPr>
-            <w:rFonts w:eastAsiaTheme="minorEastAsia"/>
-            <w:noProof/>
-            <w:color w:val="auto"/>
-            <w:lang w:eastAsia="de-CH"/>
-          </w:rPr>
-          <w:tab/>
-        </w:r>
-        <w:r>
-          <w:rPr>
-            <w:rStyle w:val="Hyperlink"/>
-            <w:noProof/>
-          </w:rPr>
-          <w:t>…?</w:t>
-        </w:r>
-        <w:r>
-          <w:rPr>
-            <w:noProof/>
-            <w:webHidden/>
-          </w:rPr>
-          <w:tab/>
-        </w:r>
-        <w:r>
-          <w:rPr>
-            <w:noProof/>
-            <w:webHidden/>
-          </w:rPr>
-          <w:fldChar w:fldCharType="begin"/>
-        </w:r>
-        <w:r>
-          <w:rPr>
-            <w:noProof/>
-            <w:webHidden/>
-          </w:rPr>
-          <w:instrText xml:space="preserve"> PAGEREF _Toc63926744 \h </w:instrText>
-        </w:r>
-        <w:r>
-          <w:rPr>
-            <w:noProof/>
-            <w:webHidden/>
-          </w:rPr>
-        </w:r>
-        <w:r>
-          <w:rPr>
-            <w:noProof/>
-            <w:webHidden/>
-          </w:rPr>
-          <w:fldChar w:fldCharType="separate"/>
-        </w:r>
-        <w:r>
-          <w:rPr>
-            <w:noProof/>
-            <w:webHidden/>
-          </w:rPr>
-          <w:t>9</w:t>
+          <w:t>14</w:t>
         </w:r>
         <w:r>
           <w:rPr>
@@ -4195,10 +4111,10 @@
           <w:b w:val="0"/>
           <w:bCs w:val="0"/>
           <w:color w:val="auto"/>
-          <w:lang w:eastAsia="de-CH"/>
+          <w:lang w:val="de-DE" w:eastAsia="de-DE"/>
         </w:rPr>
       </w:pPr>
-      <w:hyperlink w:anchor="_Toc63926745" w:history="1">
+      <w:hyperlink w:anchor="_Toc110858302" w:history="1">
         <w:r>
           <w:rPr>
             <w:rStyle w:val="Hyperlink"/>
@@ -4211,7 +4127,7 @@
             <w:b w:val="0"/>
             <w:bCs w:val="0"/>
             <w:color w:val="auto"/>
-            <w:lang w:eastAsia="de-CH"/>
+            <w:lang w:val="de-DE" w:eastAsia="de-DE"/>
           </w:rPr>
           <w:tab/>
         </w:r>
@@ -4237,7 +4153,7 @@
           <w:rPr>
             <w:webHidden/>
           </w:rPr>
-          <w:instrText xml:space="preserve"> PAGEREF _Toc63926745 \h </w:instrText>
+          <w:instrText xml:space="preserve"> PAGEREF _Toc110858302 \h </w:instrText>
         </w:r>
         <w:r>
           <w:rPr>
@@ -4254,7 +4170,7 @@
           <w:rPr>
             <w:webHidden/>
           </w:rPr>
-          <w:t>10</w:t>
+          <w:t>15</w:t>
         </w:r>
         <w:r>
           <w:rPr>
@@ -4272,10 +4188,10 @@
           <w:b w:val="0"/>
           <w:bCs w:val="0"/>
           <w:color w:val="auto"/>
-          <w:lang w:eastAsia="de-CH"/>
+          <w:lang w:val="de-DE" w:eastAsia="de-DE"/>
         </w:rPr>
       </w:pPr>
-      <w:hyperlink w:anchor="_Toc63926746" w:history="1">
+      <w:hyperlink w:anchor="_Toc110858303" w:history="1">
         <w:r>
           <w:rPr>
             <w:rStyle w:val="Hyperlink"/>
@@ -4288,7 +4204,7 @@
             <w:b w:val="0"/>
             <w:bCs w:val="0"/>
             <w:color w:val="auto"/>
-            <w:lang w:eastAsia="de-CH"/>
+            <w:lang w:val="de-DE" w:eastAsia="de-DE"/>
           </w:rPr>
           <w:tab/>
         </w:r>
@@ -4314,7 +4230,7 @@
           <w:rPr>
             <w:webHidden/>
           </w:rPr>
-          <w:instrText xml:space="preserve"> PAGEREF _Toc63926746 \h </w:instrText>
+          <w:instrText xml:space="preserve"> PAGEREF _Toc110858303 \h </w:instrText>
         </w:r>
         <w:r>
           <w:rPr>
@@ -4331,7 +4247,7 @@
           <w:rPr>
             <w:webHidden/>
           </w:rPr>
-          <w:t>11</w:t>
+          <w:t>16</w:t>
         </w:r>
         <w:r>
           <w:rPr>
@@ -4349,10 +4265,10 @@
           <w:b w:val="0"/>
           <w:bCs w:val="0"/>
           <w:color w:val="auto"/>
-          <w:lang w:eastAsia="de-CH"/>
+          <w:lang w:val="de-DE" w:eastAsia="de-DE"/>
         </w:rPr>
       </w:pPr>
-      <w:hyperlink w:anchor="_Toc63926747" w:history="1">
+      <w:hyperlink w:anchor="_Toc110858304" w:history="1">
         <w:r>
           <w:rPr>
             <w:rStyle w:val="Hyperlink"/>
@@ -4365,7 +4281,7 @@
             <w:b w:val="0"/>
             <w:bCs w:val="0"/>
             <w:color w:val="auto"/>
-            <w:lang w:eastAsia="de-CH"/>
+            <w:lang w:val="de-DE" w:eastAsia="de-DE"/>
           </w:rPr>
           <w:tab/>
         </w:r>
@@ -4391,7 +4307,7 @@
           <w:rPr>
             <w:webHidden/>
           </w:rPr>
-          <w:instrText xml:space="preserve"> PAGEREF _Toc63926747 \h </w:instrText>
+          <w:instrText xml:space="preserve"> PAGEREF _Toc110858304 \h </w:instrText>
         </w:r>
         <w:r>
           <w:rPr>
@@ -4408,7 +4324,7 @@
           <w:rPr>
             <w:webHidden/>
           </w:rPr>
-          <w:t>12</w:t>
+          <w:t>17</w:t>
         </w:r>
         <w:r>
           <w:rPr>
@@ -4425,10 +4341,10 @@
           <w:rFonts w:eastAsiaTheme="minorEastAsia"/>
           <w:noProof/>
           <w:color w:val="auto"/>
-          <w:lang w:eastAsia="de-CH"/>
+          <w:lang w:val="de-DE" w:eastAsia="de-DE"/>
         </w:rPr>
       </w:pPr>
-      <w:hyperlink w:anchor="_Toc63926748" w:history="1">
+      <w:hyperlink w:anchor="_Toc110858305" w:history="1">
         <w:r>
           <w:rPr>
             <w:rStyle w:val="Hyperlink"/>
@@ -4441,7 +4357,7 @@
             <w:rFonts w:eastAsiaTheme="minorEastAsia"/>
             <w:noProof/>
             <w:color w:val="auto"/>
-            <w:lang w:eastAsia="de-CH"/>
+            <w:lang w:val="de-DE" w:eastAsia="de-DE"/>
           </w:rPr>
           <w:tab/>
         </w:r>
@@ -4471,7 +4387,7 @@
             <w:noProof/>
             <w:webHidden/>
           </w:rPr>
-          <w:instrText xml:space="preserve"> PAGEREF _Toc63926748 \h </w:instrText>
+          <w:instrText xml:space="preserve"> PAGEREF _Toc110858305 \h </w:instrText>
         </w:r>
         <w:r>
           <w:rPr>
@@ -4491,7 +4407,7 @@
             <w:noProof/>
             <w:webHidden/>
           </w:rPr>
-          <w:t>12</w:t>
+          <w:t>17</w:t>
         </w:r>
         <w:r>
           <w:rPr>
@@ -4509,10 +4425,10 @@
           <w:rFonts w:eastAsiaTheme="minorEastAsia"/>
           <w:noProof/>
           <w:color w:val="auto"/>
-          <w:lang w:eastAsia="de-CH"/>
+          <w:lang w:val="de-DE" w:eastAsia="de-DE"/>
         </w:rPr>
       </w:pPr>
-      <w:hyperlink w:anchor="_Toc63926749" w:history="1">
+      <w:hyperlink w:anchor="_Toc110858306" w:history="1">
         <w:r>
           <w:rPr>
             <w:rStyle w:val="Hyperlink"/>
@@ -4525,7 +4441,7 @@
             <w:rFonts w:eastAsiaTheme="minorEastAsia"/>
             <w:noProof/>
             <w:color w:val="auto"/>
-            <w:lang w:eastAsia="de-CH"/>
+            <w:lang w:val="de-DE" w:eastAsia="de-DE"/>
           </w:rPr>
           <w:tab/>
         </w:r>
@@ -4555,7 +4471,7 @@
             <w:noProof/>
             <w:webHidden/>
           </w:rPr>
-          <w:instrText xml:space="preserve"> PAGEREF _Toc63926749 \h </w:instrText>
+          <w:instrText xml:space="preserve"> PAGEREF _Toc110858306 \h </w:instrText>
         </w:r>
         <w:r>
           <w:rPr>
@@ -4575,7 +4491,7 @@
             <w:noProof/>
             <w:webHidden/>
           </w:rPr>
-          <w:t>12</w:t>
+          <w:t>17</w:t>
         </w:r>
         <w:r>
           <w:rPr>
@@ -4593,10 +4509,10 @@
           <w:rFonts w:eastAsiaTheme="minorEastAsia"/>
           <w:noProof/>
           <w:color w:val="auto"/>
-          <w:lang w:eastAsia="de-CH"/>
+          <w:lang w:val="de-DE" w:eastAsia="de-DE"/>
         </w:rPr>
       </w:pPr>
-      <w:hyperlink w:anchor="_Toc63926750" w:history="1">
+      <w:hyperlink w:anchor="_Toc110858307" w:history="1">
         <w:r>
           <w:rPr>
             <w:rStyle w:val="Hyperlink"/>
@@ -4609,7 +4525,7 @@
             <w:rFonts w:eastAsiaTheme="minorEastAsia"/>
             <w:noProof/>
             <w:color w:val="auto"/>
-            <w:lang w:eastAsia="de-CH"/>
+            <w:lang w:val="de-DE" w:eastAsia="de-DE"/>
           </w:rPr>
           <w:tab/>
         </w:r>
@@ -4639,7 +4555,7 @@
             <w:noProof/>
             <w:webHidden/>
           </w:rPr>
-          <w:instrText xml:space="preserve"> PAGEREF _Toc63926750 \h </w:instrText>
+          <w:instrText xml:space="preserve"> PAGEREF _Toc110858307 \h </w:instrText>
         </w:r>
         <w:r>
           <w:rPr>
@@ -4659,7 +4575,7 @@
             <w:noProof/>
             <w:webHidden/>
           </w:rPr>
-          <w:t>12</w:t>
+          <w:t>17</w:t>
         </w:r>
         <w:r>
           <w:rPr>
@@ -4677,10 +4593,10 @@
           <w:rFonts w:eastAsiaTheme="minorEastAsia"/>
           <w:noProof/>
           <w:color w:val="auto"/>
-          <w:lang w:eastAsia="de-CH"/>
+          <w:lang w:val="de-DE" w:eastAsia="de-DE"/>
         </w:rPr>
       </w:pPr>
-      <w:hyperlink w:anchor="_Toc63926751" w:history="1">
+      <w:hyperlink w:anchor="_Toc110858308" w:history="1">
         <w:r>
           <w:rPr>
             <w:rStyle w:val="Hyperlink"/>
@@ -4693,7 +4609,7 @@
             <w:rFonts w:eastAsiaTheme="minorEastAsia"/>
             <w:noProof/>
             <w:color w:val="auto"/>
-            <w:lang w:eastAsia="de-CH"/>
+            <w:lang w:val="de-DE" w:eastAsia="de-DE"/>
           </w:rPr>
           <w:tab/>
         </w:r>
@@ -4723,7 +4639,7 @@
             <w:noProof/>
             <w:webHidden/>
           </w:rPr>
-          <w:instrText xml:space="preserve"> PAGEREF _Toc63926751 \h </w:instrText>
+          <w:instrText xml:space="preserve"> PAGEREF _Toc110858308 \h </w:instrText>
         </w:r>
         <w:r>
           <w:rPr>
@@ -4743,7 +4659,7 @@
             <w:noProof/>
             <w:webHidden/>
           </w:rPr>
-          <w:t>12</w:t>
+          <w:t>17</w:t>
         </w:r>
         <w:r>
           <w:rPr>
@@ -4762,10 +4678,10 @@
           <w:b w:val="0"/>
           <w:bCs w:val="0"/>
           <w:color w:val="auto"/>
-          <w:lang w:eastAsia="de-CH"/>
+          <w:lang w:val="de-DE" w:eastAsia="de-DE"/>
         </w:rPr>
       </w:pPr>
-      <w:hyperlink w:anchor="_Toc63926752" w:history="1">
+      <w:hyperlink w:anchor="_Toc110858309" w:history="1">
         <w:r>
           <w:rPr>
             <w:rStyle w:val="Hyperlink"/>
@@ -4778,7 +4694,7 @@
             <w:b w:val="0"/>
             <w:bCs w:val="0"/>
             <w:color w:val="auto"/>
-            <w:lang w:eastAsia="de-CH"/>
+            <w:lang w:val="de-DE" w:eastAsia="de-DE"/>
           </w:rPr>
           <w:tab/>
         </w:r>
@@ -4804,7 +4720,7 @@
           <w:rPr>
             <w:webHidden/>
           </w:rPr>
-          <w:instrText xml:space="preserve"> PAGEREF _Toc63926752 \h </w:instrText>
+          <w:instrText xml:space="preserve"> PAGEREF _Toc110858309 \h </w:instrText>
         </w:r>
         <w:r>
           <w:rPr>
@@ -4821,7 +4737,7 @@
           <w:rPr>
             <w:webHidden/>
           </w:rPr>
-          <w:t>13</w:t>
+          <w:t>18</w:t>
         </w:r>
         <w:r>
           <w:rPr>
@@ -4838,10 +4754,10 @@
           <w:rFonts w:eastAsiaTheme="minorEastAsia"/>
           <w:noProof/>
           <w:color w:val="auto"/>
-          <w:lang w:eastAsia="de-CH"/>
+          <w:lang w:val="de-DE" w:eastAsia="de-DE"/>
         </w:rPr>
       </w:pPr>
-      <w:hyperlink w:anchor="_Toc63926753" w:history="1">
+      <w:hyperlink w:anchor="_Toc110858310" w:history="1">
         <w:r>
           <w:rPr>
             <w:rStyle w:val="Hyperlink"/>
@@ -4854,7 +4770,7 @@
             <w:rFonts w:eastAsiaTheme="minorEastAsia"/>
             <w:noProof/>
             <w:color w:val="auto"/>
-            <w:lang w:eastAsia="de-CH"/>
+            <w:lang w:val="de-DE" w:eastAsia="de-DE"/>
           </w:rPr>
           <w:tab/>
         </w:r>
@@ -4884,7 +4800,7 @@
             <w:noProof/>
             <w:webHidden/>
           </w:rPr>
-          <w:instrText xml:space="preserve"> PAGEREF _Toc63926753 \h </w:instrText>
+          <w:instrText xml:space="preserve"> PAGEREF _Toc110858310 \h </w:instrText>
         </w:r>
         <w:r>
           <w:rPr>
@@ -4904,7 +4820,7 @@
             <w:noProof/>
             <w:webHidden/>
           </w:rPr>
-          <w:t>13</w:t>
+          <w:t>18</w:t>
         </w:r>
         <w:r>
           <w:rPr>
@@ -4922,10 +4838,10 @@
           <w:rFonts w:eastAsiaTheme="minorEastAsia"/>
           <w:noProof/>
           <w:color w:val="auto"/>
-          <w:lang w:eastAsia="de-CH"/>
+          <w:lang w:val="de-DE" w:eastAsia="de-DE"/>
         </w:rPr>
       </w:pPr>
-      <w:hyperlink w:anchor="_Toc63926754" w:history="1">
+      <w:hyperlink w:anchor="_Toc110858311" w:history="1">
         <w:r>
           <w:rPr>
             <w:rStyle w:val="Hyperlink"/>
@@ -4938,7 +4854,7 @@
             <w:rFonts w:eastAsiaTheme="minorEastAsia"/>
             <w:noProof/>
             <w:color w:val="auto"/>
-            <w:lang w:eastAsia="de-CH"/>
+            <w:lang w:val="de-DE" w:eastAsia="de-DE"/>
           </w:rPr>
           <w:tab/>
         </w:r>
@@ -4968,7 +4884,7 @@
             <w:noProof/>
             <w:webHidden/>
           </w:rPr>
-          <w:instrText xml:space="preserve"> PAGEREF _Toc63926754 \h </w:instrText>
+          <w:instrText xml:space="preserve"> PAGEREF _Toc110858311 \h </w:instrText>
         </w:r>
         <w:r>
           <w:rPr>
@@ -4988,7 +4904,7 @@
             <w:noProof/>
             <w:webHidden/>
           </w:rPr>
-          <w:t>13</w:t>
+          <w:t>18</w:t>
         </w:r>
         <w:r>
           <w:rPr>
@@ -5001,28 +4917,28 @@
     </w:p>
     <w:p>
       <w:pPr>
-        <w:pStyle w:val="Verzeichnis3"/>
+        <w:pStyle w:val="Verzeichnis2"/>
         <w:rPr>
           <w:rFonts w:eastAsiaTheme="minorEastAsia"/>
           <w:noProof/>
           <w:color w:val="auto"/>
-          <w:lang w:eastAsia="de-CH"/>
+          <w:lang w:val="de-DE" w:eastAsia="de-DE"/>
         </w:rPr>
       </w:pPr>
-      <w:hyperlink w:anchor="_Toc63926755" w:history="1">
+      <w:hyperlink w:anchor="_Toc110858312" w:history="1">
         <w:r>
           <w:rPr>
             <w:rStyle w:val="Hyperlink"/>
             <w:noProof/>
           </w:rPr>
-          <w:t>7.2.1</w:t>
+          <w:t>7.3</w:t>
         </w:r>
         <w:r>
           <w:rPr>
             <w:rFonts w:eastAsiaTheme="minorEastAsia"/>
             <w:noProof/>
             <w:color w:val="auto"/>
-            <w:lang w:eastAsia="de-CH"/>
+            <w:lang w:val="de-DE" w:eastAsia="de-DE"/>
           </w:rPr>
           <w:tab/>
         </w:r>
@@ -5052,7 +4968,7 @@
             <w:noProof/>
             <w:webHidden/>
           </w:rPr>
-          <w:instrText xml:space="preserve"> PAGEREF _Toc63926755 \h </w:instrText>
+          <w:instrText xml:space="preserve"> PAGEREF _Toc110858312 \h </w:instrText>
         </w:r>
         <w:r>
           <w:rPr>
@@ -5072,7 +4988,7 @@
             <w:noProof/>
             <w:webHidden/>
           </w:rPr>
-          <w:t>13</w:t>
+          <w:t>18</w:t>
         </w:r>
         <w:r>
           <w:rPr>
@@ -5091,10 +5007,10 @@
           <w:b w:val="0"/>
           <w:bCs w:val="0"/>
           <w:color w:val="auto"/>
-          <w:lang w:eastAsia="de-CH"/>
+          <w:lang w:val="de-DE" w:eastAsia="de-DE"/>
         </w:rPr>
       </w:pPr>
-      <w:hyperlink w:anchor="_Toc63926756" w:history="1">
+      <w:hyperlink w:anchor="_Toc110858313" w:history="1">
         <w:r>
           <w:rPr>
             <w:rStyle w:val="Hyperlink"/>
@@ -5107,7 +5023,7 @@
             <w:b w:val="0"/>
             <w:bCs w:val="0"/>
             <w:color w:val="auto"/>
-            <w:lang w:eastAsia="de-CH"/>
+            <w:lang w:val="de-DE" w:eastAsia="de-DE"/>
           </w:rPr>
           <w:tab/>
         </w:r>
@@ -5133,7 +5049,7 @@
           <w:rPr>
             <w:webHidden/>
           </w:rPr>
-          <w:instrText xml:space="preserve"> PAGEREF _Toc63926756 \h </w:instrText>
+          <w:instrText xml:space="preserve"> PAGEREF _Toc110858313 \h </w:instrText>
         </w:r>
         <w:r>
           <w:rPr>
@@ -5150,7 +5066,7 @@
           <w:rPr>
             <w:webHidden/>
           </w:rPr>
-          <w:t>14</w:t>
+          <w:t>19</w:t>
         </w:r>
         <w:r>
           <w:rPr>
@@ -5168,10 +5084,10 @@
           <w:b w:val="0"/>
           <w:bCs w:val="0"/>
           <w:color w:val="auto"/>
-          <w:lang w:eastAsia="de-CH"/>
+          <w:lang w:val="de-DE" w:eastAsia="de-DE"/>
         </w:rPr>
       </w:pPr>
-      <w:hyperlink w:anchor="_Toc63926757" w:history="1">
+      <w:hyperlink w:anchor="_Toc110858314" w:history="1">
         <w:r>
           <w:rPr>
             <w:rStyle w:val="Hyperlink"/>
@@ -5184,7 +5100,7 @@
             <w:b w:val="0"/>
             <w:bCs w:val="0"/>
             <w:color w:val="auto"/>
-            <w:lang w:eastAsia="de-CH"/>
+            <w:lang w:val="de-DE" w:eastAsia="de-DE"/>
           </w:rPr>
           <w:tab/>
         </w:r>
@@ -5210,7 +5126,7 @@
           <w:rPr>
             <w:webHidden/>
           </w:rPr>
-          <w:instrText xml:space="preserve"> PAGEREF _Toc63926757 \h </w:instrText>
+          <w:instrText xml:space="preserve"> PAGEREF _Toc110858314 \h </w:instrText>
         </w:r>
         <w:r>
           <w:rPr>
@@ -5227,7 +5143,7 @@
           <w:rPr>
             <w:webHidden/>
           </w:rPr>
-          <w:t>15</w:t>
+          <w:t>20</w:t>
         </w:r>
         <w:r>
           <w:rPr>
@@ -5245,10 +5161,10 @@
           <w:b w:val="0"/>
           <w:bCs w:val="0"/>
           <w:color w:val="auto"/>
-          <w:lang w:eastAsia="de-CH"/>
+          <w:lang w:val="de-DE" w:eastAsia="de-DE"/>
         </w:rPr>
       </w:pPr>
-      <w:hyperlink w:anchor="_Toc63926758" w:history="1">
+      <w:hyperlink w:anchor="_Toc110858315" w:history="1">
         <w:r>
           <w:rPr>
             <w:rStyle w:val="Hyperlink"/>
@@ -5261,7 +5177,7 @@
             <w:b w:val="0"/>
             <w:bCs w:val="0"/>
             <w:color w:val="auto"/>
-            <w:lang w:eastAsia="de-CH"/>
+            <w:lang w:val="de-DE" w:eastAsia="de-DE"/>
           </w:rPr>
           <w:tab/>
         </w:r>
@@ -5287,7 +5203,7 @@
           <w:rPr>
             <w:webHidden/>
           </w:rPr>
-          <w:instrText xml:space="preserve"> PAGEREF _Toc63926758 \h </w:instrText>
+          <w:instrText xml:space="preserve"> PAGEREF _Toc110858315 \h </w:instrText>
         </w:r>
         <w:r>
           <w:rPr>
@@ -5304,7 +5220,7 @@
           <w:rPr>
             <w:webHidden/>
           </w:rPr>
-          <w:t>16</w:t>
+          <w:t>21</w:t>
         </w:r>
         <w:r>
           <w:rPr>
@@ -5321,10 +5237,10 @@
           <w:rFonts w:eastAsiaTheme="minorEastAsia"/>
           <w:noProof/>
           <w:color w:val="auto"/>
-          <w:lang w:eastAsia="de-CH"/>
+          <w:lang w:val="de-DE" w:eastAsia="de-DE"/>
         </w:rPr>
       </w:pPr>
-      <w:hyperlink w:anchor="_Toc63926759" w:history="1">
+      <w:hyperlink w:anchor="_Toc110858316" w:history="1">
         <w:r>
           <w:rPr>
             <w:rStyle w:val="Hyperlink"/>
@@ -5337,7 +5253,7 @@
             <w:rFonts w:eastAsiaTheme="minorEastAsia"/>
             <w:noProof/>
             <w:color w:val="auto"/>
-            <w:lang w:eastAsia="de-CH"/>
+            <w:lang w:val="de-DE" w:eastAsia="de-DE"/>
           </w:rPr>
           <w:tab/>
         </w:r>
@@ -5367,7 +5283,7 @@
             <w:noProof/>
             <w:webHidden/>
           </w:rPr>
-          <w:instrText xml:space="preserve"> PAGEREF _Toc63926759 \h </w:instrText>
+          <w:instrText xml:space="preserve"> PAGEREF _Toc110858316 \h </w:instrText>
         </w:r>
         <w:r>
           <w:rPr>
@@ -5387,7 +5303,7 @@
             <w:noProof/>
             <w:webHidden/>
           </w:rPr>
-          <w:t>16</w:t>
+          <w:t>21</w:t>
         </w:r>
         <w:r>
           <w:rPr>
@@ -5405,10 +5321,10 @@
           <w:rFonts w:eastAsiaTheme="minorEastAsia"/>
           <w:noProof/>
           <w:color w:val="auto"/>
-          <w:lang w:eastAsia="de-CH"/>
+          <w:lang w:val="de-DE" w:eastAsia="de-DE"/>
         </w:rPr>
       </w:pPr>
-      <w:hyperlink w:anchor="_Toc63926760" w:history="1">
+      <w:hyperlink w:anchor="_Toc110858317" w:history="1">
         <w:r>
           <w:rPr>
             <w:rStyle w:val="Hyperlink"/>
@@ -5421,7 +5337,7 @@
             <w:rFonts w:eastAsiaTheme="minorEastAsia"/>
             <w:noProof/>
             <w:color w:val="auto"/>
-            <w:lang w:eastAsia="de-CH"/>
+            <w:lang w:val="de-DE" w:eastAsia="de-DE"/>
           </w:rPr>
           <w:tab/>
         </w:r>
@@ -5451,7 +5367,7 @@
             <w:noProof/>
             <w:webHidden/>
           </w:rPr>
-          <w:instrText xml:space="preserve"> PAGEREF _Toc63926760 \h </w:instrText>
+          <w:instrText xml:space="preserve"> PAGEREF _Toc110858317 \h </w:instrText>
         </w:r>
         <w:r>
           <w:rPr>
@@ -5471,7 +5387,7 @@
             <w:noProof/>
             <w:webHidden/>
           </w:rPr>
-          <w:t>16</w:t>
+          <w:t>21</w:t>
         </w:r>
         <w:r>
           <w:rPr>
@@ -5489,10 +5405,10 @@
           <w:rFonts w:eastAsiaTheme="minorEastAsia"/>
           <w:noProof/>
           <w:color w:val="auto"/>
-          <w:lang w:eastAsia="de-CH"/>
+          <w:lang w:val="de-DE" w:eastAsia="de-DE"/>
         </w:rPr>
       </w:pPr>
-      <w:hyperlink w:anchor="_Toc63926761" w:history="1">
+      <w:hyperlink w:anchor="_Toc110858318" w:history="1">
         <w:r>
           <w:rPr>
             <w:rStyle w:val="Hyperlink"/>
@@ -5505,7 +5421,7 @@
             <w:rFonts w:eastAsiaTheme="minorEastAsia"/>
             <w:noProof/>
             <w:color w:val="auto"/>
-            <w:lang w:eastAsia="de-CH"/>
+            <w:lang w:val="de-DE" w:eastAsia="de-DE"/>
           </w:rPr>
           <w:tab/>
         </w:r>
@@ -5535,7 +5451,7 @@
             <w:noProof/>
             <w:webHidden/>
           </w:rPr>
-          <w:instrText xml:space="preserve"> PAGEREF _Toc63926761 \h </w:instrText>
+          <w:instrText xml:space="preserve"> PAGEREF _Toc110858318 \h </w:instrText>
         </w:r>
         <w:r>
           <w:rPr>
@@ -5555,7 +5471,7 @@
             <w:noProof/>
             <w:webHidden/>
           </w:rPr>
-          <w:t>16</w:t>
+          <w:t>21</w:t>
         </w:r>
         <w:r>
           <w:rPr>
@@ -5573,10 +5489,10 @@
           <w:rFonts w:eastAsiaTheme="minorEastAsia"/>
           <w:noProof/>
           <w:color w:val="auto"/>
-          <w:lang w:eastAsia="de-CH"/>
+          <w:lang w:val="de-DE" w:eastAsia="de-DE"/>
         </w:rPr>
       </w:pPr>
-      <w:hyperlink w:anchor="_Toc63926762" w:history="1">
+      <w:hyperlink w:anchor="_Toc110858319" w:history="1">
         <w:r>
           <w:rPr>
             <w:rStyle w:val="Hyperlink"/>
@@ -5589,7 +5505,7 @@
             <w:rFonts w:eastAsiaTheme="minorEastAsia"/>
             <w:noProof/>
             <w:color w:val="auto"/>
-            <w:lang w:eastAsia="de-CH"/>
+            <w:lang w:val="de-DE" w:eastAsia="de-DE"/>
           </w:rPr>
           <w:tab/>
         </w:r>
@@ -5619,7 +5535,7 @@
             <w:noProof/>
             <w:webHidden/>
           </w:rPr>
-          <w:instrText xml:space="preserve"> PAGEREF _Toc63926762 \h </w:instrText>
+          <w:instrText xml:space="preserve"> PAGEREF _Toc110858319 \h </w:instrText>
         </w:r>
         <w:r>
           <w:rPr>
@@ -5639,7 +5555,7 @@
             <w:noProof/>
             <w:webHidden/>
           </w:rPr>
-          <w:t>16</w:t>
+          <w:t>21</w:t>
         </w:r>
         <w:r>
           <w:rPr>
@@ -5658,10 +5574,10 @@
           <w:b w:val="0"/>
           <w:bCs w:val="0"/>
           <w:color w:val="auto"/>
-          <w:lang w:eastAsia="de-CH"/>
+          <w:lang w:val="de-DE" w:eastAsia="de-DE"/>
         </w:rPr>
       </w:pPr>
-      <w:hyperlink w:anchor="_Toc63926763" w:history="1">
+      <w:hyperlink w:anchor="_Toc110858320" w:history="1">
         <w:r>
           <w:rPr>
             <w:rStyle w:val="Hyperlink"/>
@@ -5684,7 +5600,7 @@
           <w:rPr>
             <w:webHidden/>
           </w:rPr>
-          <w:instrText xml:space="preserve"> PAGEREF _Toc63926763 \h </w:instrText>
+          <w:instrText xml:space="preserve"> PAGEREF _Toc110858320 \h </w:instrText>
         </w:r>
         <w:r>
           <w:rPr>
@@ -5718,10 +5634,10 @@
           <w:rFonts w:eastAsiaTheme="minorEastAsia"/>
           <w:noProof/>
           <w:color w:val="auto"/>
-          <w:lang w:eastAsia="de-CH"/>
+          <w:lang w:val="de-DE" w:eastAsia="de-DE"/>
         </w:rPr>
       </w:pPr>
-      <w:hyperlink w:anchor="_Toc63926764" w:history="1">
+      <w:hyperlink w:anchor="_Toc110858321" w:history="1">
         <w:r>
           <w:rPr>
             <w:rStyle w:val="Hyperlink"/>
@@ -5734,7 +5650,7 @@
             <w:rFonts w:eastAsiaTheme="minorEastAsia"/>
             <w:noProof/>
             <w:color w:val="auto"/>
-            <w:lang w:eastAsia="de-CH"/>
+            <w:lang w:val="de-DE" w:eastAsia="de-DE"/>
           </w:rPr>
           <w:tab/>
         </w:r>
@@ -5764,7 +5680,7 @@
             <w:noProof/>
             <w:webHidden/>
           </w:rPr>
-          <w:instrText xml:space="preserve"> PAGEREF _Toc63926764 \h </w:instrText>
+          <w:instrText xml:space="preserve"> PAGEREF _Toc110858321 \h </w:instrText>
         </w:r>
         <w:r>
           <w:rPr>
@@ -5802,10 +5718,10 @@
           <w:rFonts w:eastAsiaTheme="minorEastAsia"/>
           <w:noProof/>
           <w:color w:val="auto"/>
-          <w:lang w:eastAsia="de-CH"/>
+          <w:lang w:val="de-DE" w:eastAsia="de-DE"/>
         </w:rPr>
       </w:pPr>
-      <w:hyperlink w:anchor="_Toc63926765" w:history="1">
+      <w:hyperlink w:anchor="_Toc110858322" w:history="1">
         <w:r>
           <w:rPr>
             <w:rStyle w:val="Hyperlink"/>
@@ -5818,7 +5734,7 @@
             <w:rFonts w:eastAsiaTheme="minorEastAsia"/>
             <w:noProof/>
             <w:color w:val="auto"/>
-            <w:lang w:eastAsia="de-CH"/>
+            <w:lang w:val="de-DE" w:eastAsia="de-DE"/>
           </w:rPr>
           <w:tab/>
         </w:r>
@@ -5848,7 +5764,7 @@
             <w:noProof/>
             <w:webHidden/>
           </w:rPr>
-          <w:instrText xml:space="preserve"> PAGEREF _Toc63926765 \h </w:instrText>
+          <w:instrText xml:space="preserve"> PAGEREF _Toc110858322 \h </w:instrText>
         </w:r>
         <w:r>
           <w:rPr>
@@ -5903,7 +5819,7 @@
       <w:pPr>
         <w:pStyle w:val="berschrift1"/>
       </w:pPr>
-      <w:bookmarkStart w:id="1" w:name="_Toc63926697"/>
+      <w:bookmarkStart w:id="1" w:name="_Toc110858255"/>
       <w:r>
         <w:lastRenderedPageBreak/>
         <w:t>Allgemein</w:t>
@@ -5922,7 +5838,7 @@
       <w:pPr>
         <w:pStyle w:val="berschrift2"/>
       </w:pPr>
-      <w:bookmarkStart w:id="2" w:name="_Toc63926698"/>
+      <w:bookmarkStart w:id="2" w:name="_Toc110858256"/>
       <w:r>
         <w:t>Projektinformationen</w:t>
       </w:r>
@@ -6041,7 +5957,7 @@
         <w:pStyle w:val="berschrift2"/>
       </w:pPr>
       <w:bookmarkStart w:id="3" w:name="_Toc25148299"/>
-      <w:bookmarkStart w:id="4" w:name="_Toc63926699"/>
+      <w:bookmarkStart w:id="4" w:name="_Toc110858257"/>
       <w:r>
         <w:t>Projektorganisation</w:t>
       </w:r>
@@ -6052,19 +5968,19 @@
       <w:pPr>
         <w:pStyle w:val="berschrift3"/>
       </w:pPr>
-      <w:bookmarkStart w:id="5" w:name="_Toc63926700"/>
-      <w:bookmarkStart w:id="6" w:name="_Toc25148300"/>
+      <w:bookmarkStart w:id="5" w:name="_Toc25148300"/>
+      <w:bookmarkStart w:id="6" w:name="_Toc110858258"/>
       <w:r>
         <w:t>Beteiligte</w:t>
       </w:r>
       <w:r>
         <w:t xml:space="preserve"> Personen</w:t>
       </w:r>
+      <w:bookmarkEnd w:id="6"/>
+      <w:r>
+        <w:t xml:space="preserve"> </w:t>
+      </w:r>
       <w:bookmarkEnd w:id="5"/>
-      <w:r>
-        <w:t xml:space="preserve"> </w:t>
-      </w:r>
-      <w:bookmarkEnd w:id="6"/>
     </w:p>
     <w:tbl>
       <w:tblPr>
@@ -6585,7 +6501,7 @@
         <w:pStyle w:val="berschrift3"/>
       </w:pPr>
       <w:bookmarkStart w:id="7" w:name="_Toc25148301"/>
-      <w:bookmarkStart w:id="8" w:name="_Toc63926701"/>
+      <w:bookmarkStart w:id="8" w:name="_Toc110858259"/>
       <w:r>
         <w:lastRenderedPageBreak/>
         <w:t>Aufgabenstellung</w:t>
@@ -6649,7 +6565,7 @@
       <w:pPr>
         <w:pStyle w:val="berschrift3"/>
       </w:pPr>
-      <w:bookmarkStart w:id="10" w:name="_Toc63926702"/>
+      <w:bookmarkStart w:id="10" w:name="_Toc110858260"/>
       <w:r>
         <w:t>Executive Summary</w:t>
       </w:r>
@@ -6773,7 +6689,7 @@
         <w:pStyle w:val="berschrift3"/>
       </w:pPr>
       <w:bookmarkStart w:id="11" w:name="_Toc25148303"/>
-      <w:bookmarkStart w:id="12" w:name="_Toc63926703"/>
+      <w:bookmarkStart w:id="12" w:name="_Toc110858261"/>
       <w:bookmarkEnd w:id="9"/>
       <w:r>
         <w:t>Vorkenntnisse</w:t>
@@ -6856,7 +6772,7 @@
         <w:pStyle w:val="berschrift3"/>
       </w:pPr>
       <w:bookmarkStart w:id="13" w:name="_Toc25148304"/>
-      <w:bookmarkStart w:id="14" w:name="_Toc63926704"/>
+      <w:bookmarkStart w:id="14" w:name="_Toc110858262"/>
       <w:r>
         <w:t>Vorarbeiten</w:t>
       </w:r>
@@ -6920,7 +6836,7 @@
         <w:pStyle w:val="berschrift3"/>
       </w:pPr>
       <w:bookmarkStart w:id="15" w:name="_Toc25148305"/>
-      <w:bookmarkStart w:id="16" w:name="_Toc63926705"/>
+      <w:bookmarkStart w:id="16" w:name="_Toc110858263"/>
       <w:r>
         <w:t>Firmenstandards</w:t>
       </w:r>
@@ -7040,7 +6956,7 @@
         <w:pStyle w:val="berschrift2"/>
       </w:pPr>
       <w:bookmarkStart w:id="17" w:name="_Toc25148306"/>
-      <w:bookmarkStart w:id="18" w:name="_Toc63926706"/>
+      <w:bookmarkStart w:id="18" w:name="_Toc110858264"/>
       <w:r>
         <w:t>Arbeitsmethode</w:t>
       </w:r>
@@ -7082,7 +6998,7 @@
       <w:pPr>
         <w:pStyle w:val="berschrift2"/>
       </w:pPr>
-      <w:bookmarkStart w:id="19" w:name="_Toc63926707"/>
+      <w:bookmarkStart w:id="19" w:name="_Toc110858265"/>
       <w:r>
         <w:lastRenderedPageBreak/>
         <w:t>Zeitplan</w:t>
@@ -7204,7 +7120,7 @@
         <w:pStyle w:val="berschrift2"/>
       </w:pPr>
       <w:bookmarkStart w:id="20" w:name="_Toc25148308"/>
-      <w:bookmarkStart w:id="21" w:name="_Toc63926708"/>
+      <w:bookmarkStart w:id="21" w:name="_Toc110858266"/>
       <w:r>
         <w:lastRenderedPageBreak/>
         <w:t>Gewählte Parameter</w:t>
@@ -7225,7 +7141,7 @@
         <w:pStyle w:val="berschrift2"/>
       </w:pPr>
       <w:bookmarkStart w:id="22" w:name="_Toc25148309"/>
-      <w:bookmarkStart w:id="23" w:name="_Toc63926709"/>
+      <w:bookmarkStart w:id="23" w:name="_Toc110858267"/>
       <w:r>
         <w:t>Arbeitsjournal</w:t>
       </w:r>
@@ -7281,15 +7197,15 @@
         <w:pStyle w:val="berschrift3"/>
       </w:pPr>
       <w:bookmarkStart w:id="24" w:name="_Toc25148310"/>
-      <w:bookmarkStart w:id="25" w:name="_Toc63926710"/>
+      <w:bookmarkStart w:id="25" w:name="_Toc110858268"/>
       <w:r>
         <w:t xml:space="preserve">Tag 1: </w:t>
       </w:r>
       <w:bookmarkEnd w:id="24"/>
+      <w:r>
+        <w:t>08.08.2022</w:t>
+      </w:r>
       <w:bookmarkEnd w:id="25"/>
-      <w:r>
-        <w:t>08.08.2022</w:t>
-      </w:r>
     </w:p>
     <w:tbl>
       <w:tblPr>
@@ -7642,7 +7558,11 @@
               </w:rPr>
             </w:pPr>
             <w:r>
-              <w:t>Text…</w:t>
+              <w:rPr>
+                <w:b/>
+                <w:bCs/>
+              </w:rPr>
+              <w:t>Heute konnte ich die Aufgabenstellung durchstudiert, alle User Storys aufgeschrieben, alle Designs entworfen und dass aussehen mittel CSS fertig erstellt. Zudem habe ich das Use Case Diagramm erstellt.</w:t>
             </w:r>
           </w:p>
         </w:tc>
@@ -7853,15 +7773,15 @@
       <w:pPr>
         <w:pStyle w:val="berschrift3"/>
       </w:pPr>
-      <w:bookmarkStart w:id="26" w:name="_Toc63926711"/>
-      <w:bookmarkStart w:id="27" w:name="_Toc25148312"/>
+      <w:bookmarkStart w:id="26" w:name="_Toc25148312"/>
+      <w:bookmarkStart w:id="27" w:name="_Toc110858269"/>
       <w:r>
         <w:t xml:space="preserve">Tag 2: </w:t>
       </w:r>
-      <w:bookmarkEnd w:id="26"/>
       <w:r>
         <w:t>09.08.2022</w:t>
       </w:r>
+      <w:bookmarkEnd w:id="27"/>
     </w:p>
     <w:tbl>
       <w:tblPr>
@@ -8373,6 +8293,7 @@
               <w:rPr>
                 <w:b/>
               </w:rPr>
+              <w:lastRenderedPageBreak/>
               <w:t>Reflexion</w:t>
             </w:r>
           </w:p>
@@ -8401,16 +8322,15 @@
       <w:pPr>
         <w:pStyle w:val="berschrift3"/>
       </w:pPr>
-      <w:bookmarkStart w:id="28" w:name="_Toc63926712"/>
-      <w:r>
-        <w:lastRenderedPageBreak/>
+      <w:bookmarkStart w:id="28" w:name="_Toc110858270"/>
+      <w:r>
         <w:t xml:space="preserve">Tag 3: </w:t>
       </w:r>
-      <w:bookmarkEnd w:id="27"/>
+      <w:bookmarkEnd w:id="26"/>
+      <w:r>
+        <w:t>10.08.2022</w:t>
+      </w:r>
       <w:bookmarkEnd w:id="28"/>
-      <w:r>
-        <w:t>10.08.2022</w:t>
-      </w:r>
     </w:p>
     <w:tbl>
       <w:tblPr>
@@ -8951,15 +8871,15 @@
         <w:pStyle w:val="berschrift3"/>
       </w:pPr>
       <w:bookmarkStart w:id="29" w:name="_Toc25148313"/>
-      <w:bookmarkStart w:id="30" w:name="_Toc63926713"/>
+      <w:bookmarkStart w:id="30" w:name="_Toc110858271"/>
       <w:r>
         <w:t xml:space="preserve">Tag 4: </w:t>
       </w:r>
       <w:bookmarkEnd w:id="29"/>
+      <w:r>
+        <w:t>11.08.2022</w:t>
+      </w:r>
       <w:bookmarkEnd w:id="30"/>
-      <w:r>
-        <w:t>11.08.2022</w:t>
-      </w:r>
     </w:p>
     <w:tbl>
       <w:tblPr>
@@ -9493,15 +9413,15 @@
         <w:pStyle w:val="berschrift3"/>
       </w:pPr>
       <w:bookmarkStart w:id="31" w:name="_Toc25148314"/>
-      <w:bookmarkStart w:id="32" w:name="_Toc63926714"/>
+      <w:bookmarkStart w:id="32" w:name="_Toc110858272"/>
       <w:r>
         <w:t xml:space="preserve">Tag 5: </w:t>
       </w:r>
       <w:bookmarkEnd w:id="31"/>
+      <w:r>
+        <w:t>12.08.2022</w:t>
+      </w:r>
       <w:bookmarkEnd w:id="32"/>
-      <w:r>
-        <w:t>12.08.2022</w:t>
-      </w:r>
     </w:p>
     <w:tbl>
       <w:tblPr>
@@ -9884,6 +9804,7 @@
               <w:rPr>
                 <w:b/>
               </w:rPr>
+              <w:lastRenderedPageBreak/>
               <w:t>Erfolgreiche oder erfolglose Tests</w:t>
             </w:r>
           </w:p>
@@ -10034,14 +9955,14 @@
       <w:pPr>
         <w:pStyle w:val="berschrift3"/>
       </w:pPr>
-      <w:bookmarkStart w:id="33" w:name="_Toc63926715"/>
+      <w:bookmarkStart w:id="33" w:name="_Toc110858273"/>
       <w:r>
         <w:t xml:space="preserve">Tag 6: </w:t>
       </w:r>
+      <w:r>
+        <w:t>16.08.2022</w:t>
+      </w:r>
       <w:bookmarkEnd w:id="33"/>
-      <w:r>
-        <w:t>16.08.2022</w:t>
-      </w:r>
     </w:p>
     <w:tbl>
       <w:tblPr>
@@ -10575,15 +10496,15 @@
         <w:pStyle w:val="berschrift3"/>
       </w:pPr>
       <w:bookmarkStart w:id="34" w:name="_Toc25148316"/>
-      <w:bookmarkStart w:id="35" w:name="_Toc63926716"/>
+      <w:bookmarkStart w:id="35" w:name="_Toc110858274"/>
       <w:r>
         <w:t xml:space="preserve">Tag 7: </w:t>
       </w:r>
       <w:bookmarkEnd w:id="34"/>
+      <w:r>
+        <w:t>17.08.2022</w:t>
+      </w:r>
       <w:bookmarkEnd w:id="35"/>
-      <w:r>
-        <w:t>17.08.2022</w:t>
-      </w:r>
     </w:p>
     <w:tbl>
       <w:tblPr>
@@ -11117,15 +11038,16 @@
         <w:pStyle w:val="berschrift3"/>
       </w:pPr>
       <w:bookmarkStart w:id="36" w:name="_Toc25148317"/>
-      <w:bookmarkStart w:id="37" w:name="_Toc63926717"/>
-      <w:r>
+      <w:bookmarkStart w:id="37" w:name="_Toc110858275"/>
+      <w:r>
+        <w:lastRenderedPageBreak/>
         <w:t xml:space="preserve">Tag 8: </w:t>
       </w:r>
       <w:bookmarkEnd w:id="36"/>
+      <w:r>
+        <w:t>18.08.2022</w:t>
+      </w:r>
       <w:bookmarkEnd w:id="37"/>
-      <w:r>
-        <w:t>18.08.2022</w:t>
-      </w:r>
     </w:p>
     <w:tbl>
       <w:tblPr>
@@ -11237,7 +11159,6 @@
           </w:p>
           <w:p>
             <w:r>
-              <w:lastRenderedPageBreak/>
               <w:t>Aufgabe 2</w:t>
             </w:r>
           </w:p>
@@ -11249,7 +11170,6 @@
           </w:tcPr>
           <w:p>
             <w:r>
-              <w:lastRenderedPageBreak/>
               <w:t>Erreicht</w:t>
             </w:r>
           </w:p>
@@ -11661,15 +11581,15 @@
         <w:pStyle w:val="berschrift3"/>
       </w:pPr>
       <w:bookmarkStart w:id="38" w:name="_Toc25148318"/>
-      <w:bookmarkStart w:id="39" w:name="_Toc63926718"/>
+      <w:bookmarkStart w:id="39" w:name="_Toc110858276"/>
       <w:r>
         <w:t xml:space="preserve">Tag 9: </w:t>
       </w:r>
       <w:bookmarkEnd w:id="38"/>
+      <w:r>
+        <w:t>19.08.2022</w:t>
+      </w:r>
       <w:bookmarkEnd w:id="39"/>
-      <w:r>
-        <w:t>19.08.2022</w:t>
-      </w:r>
     </w:p>
     <w:tbl>
       <w:tblPr>
@@ -12203,15 +12123,15 @@
         <w:pStyle w:val="berschrift3"/>
       </w:pPr>
       <w:bookmarkStart w:id="40" w:name="_Toc25148319"/>
-      <w:bookmarkStart w:id="41" w:name="_Toc63926719"/>
+      <w:bookmarkStart w:id="41" w:name="_Toc110858277"/>
       <w:r>
         <w:t xml:space="preserve">Tag 10: </w:t>
       </w:r>
       <w:bookmarkEnd w:id="40"/>
+      <w:r>
+        <w:t>20.08.2022</w:t>
+      </w:r>
       <w:bookmarkEnd w:id="41"/>
-      <w:r>
-        <w:t>20.08.2022</w:t>
-      </w:r>
     </w:p>
     <w:tbl>
       <w:tblPr>
@@ -12633,6 +12553,7 @@
               <w:rPr>
                 <w:b/>
               </w:rPr>
+              <w:lastRenderedPageBreak/>
               <w:t>Beanspruchte Hilfe</w:t>
             </w:r>
           </w:p>
@@ -12745,7 +12666,7 @@
         <w:pStyle w:val="berschrift1"/>
       </w:pPr>
       <w:bookmarkStart w:id="42" w:name="_Toc25148320"/>
-      <w:bookmarkStart w:id="43" w:name="_Toc63926720"/>
+      <w:bookmarkStart w:id="43" w:name="_Toc110858278"/>
       <w:r>
         <w:lastRenderedPageBreak/>
         <w:t>Analyse</w:t>
@@ -12758,7 +12679,7 @@
         <w:pStyle w:val="berschrift2"/>
       </w:pPr>
       <w:bookmarkStart w:id="44" w:name="_Toc25148321"/>
-      <w:bookmarkStart w:id="45" w:name="_Toc63926721"/>
+      <w:bookmarkStart w:id="45" w:name="_Toc110858279"/>
       <w:r>
         <w:t xml:space="preserve">User </w:t>
       </w:r>
@@ -14108,8 +14029,9 @@
         <w:pStyle w:val="berschrift2"/>
       </w:pPr>
       <w:bookmarkStart w:id="46" w:name="_Toc25148322"/>
-      <w:bookmarkStart w:id="47" w:name="_Toc63926722"/>
-      <w:r>
+      <w:bookmarkStart w:id="47" w:name="_Toc110858280"/>
+      <w:r>
+        <w:lastRenderedPageBreak/>
         <w:t>Use Case</w:t>
       </w:r>
       <w:bookmarkEnd w:id="46"/>
@@ -14118,9 +14040,90 @@
     <w:p>
       <w:pPr>
         <w:pStyle w:val="K-Einzug"/>
-      </w:pPr>
-      <w:r>
-        <w:t>Diagramm einfügen.</w:t>
+        <w:keepNext/>
+      </w:pPr>
+      <w:r>
+        <w:rPr>
+          <w:noProof/>
+        </w:rPr>
+        <w:lastRenderedPageBreak/>
+        <w:drawing>
+          <wp:inline distT="0" distB="0" distL="0" distR="0" wp14:anchorId="14102231" wp14:editId="143290C3">
+            <wp:extent cx="6114415" cy="8237855"/>
+            <wp:effectExtent l="0" t="0" r="635" b="0"/>
+            <wp:docPr id="20" name="Grafik 20"/>
+            <wp:cNvGraphicFramePr>
+              <a:graphicFrameLocks xmlns:a="http://schemas.openxmlformats.org/drawingml/2006/main" noChangeAspect="1"/>
+            </wp:cNvGraphicFramePr>
+            <a:graphic xmlns:a="http://schemas.openxmlformats.org/drawingml/2006/main">
+              <a:graphicData uri="http://schemas.openxmlformats.org/drawingml/2006/picture">
+                <pic:pic xmlns:pic="http://schemas.openxmlformats.org/drawingml/2006/picture">
+                  <pic:nvPicPr>
+                    <pic:cNvPr id="0" name="Picture 1"/>
+                    <pic:cNvPicPr>
+                      <a:picLocks noChangeAspect="1" noChangeArrowheads="1"/>
+                    </pic:cNvPicPr>
+                  </pic:nvPicPr>
+                  <pic:blipFill>
+                    <a:blip r:embed="rId20">
+                      <a:extLst>
+                        <a:ext uri="{28A0092B-C50C-407E-A947-70E740481C1C}">
+                          <a14:useLocalDpi xmlns:a14="http://schemas.microsoft.com/office/drawing/2010/main" val="0"/>
+                        </a:ext>
+                      </a:extLst>
+                    </a:blip>
+                    <a:srcRect/>
+                    <a:stretch>
+                      <a:fillRect/>
+                    </a:stretch>
+                  </pic:blipFill>
+                  <pic:spPr bwMode="auto">
+                    <a:xfrm>
+                      <a:off x="0" y="0"/>
+                      <a:ext cx="6114415" cy="8237855"/>
+                    </a:xfrm>
+                    <a:prstGeom prst="rect">
+                      <a:avLst/>
+                    </a:prstGeom>
+                    <a:noFill/>
+                    <a:ln>
+                      <a:noFill/>
+                    </a:ln>
+                  </pic:spPr>
+                </pic:pic>
+              </a:graphicData>
+            </a:graphic>
+          </wp:inline>
+        </w:drawing>
+      </w:r>
+    </w:p>
+    <w:p>
+      <w:pPr>
+        <w:pStyle w:val="Beschriftung"/>
+      </w:pPr>
+      <w:r>
+        <w:t xml:space="preserve">Abbildung </w:t>
+      </w:r>
+      <w:r>
+        <w:fldChar w:fldCharType="begin"/>
+      </w:r>
+      <w:r>
+        <w:instrText xml:space="preserve"> SEQ Abbildung \* ARABIC </w:instrText>
+      </w:r>
+      <w:r>
+        <w:fldChar w:fldCharType="separate"/>
+      </w:r>
+      <w:r>
+        <w:rPr>
+          <w:noProof/>
+        </w:rPr>
+        <w:t>1</w:t>
+      </w:r>
+      <w:r>
+        <w:fldChar w:fldCharType="end"/>
+      </w:r>
+      <w:r>
+        <w:t>: Use Case Diagram</w:t>
       </w:r>
     </w:p>
     <w:p>
@@ -14133,7 +14136,7 @@
         <w:pStyle w:val="berschrift2"/>
       </w:pPr>
       <w:bookmarkStart w:id="48" w:name="_Toc25148323"/>
-      <w:bookmarkStart w:id="49" w:name="_Toc63926723"/>
+      <w:bookmarkStart w:id="49" w:name="_Toc110858281"/>
       <w:r>
         <w:t>Anforderungen</w:t>
       </w:r>
@@ -14145,7 +14148,7 @@
         <w:pStyle w:val="berschrift3"/>
       </w:pPr>
       <w:bookmarkStart w:id="50" w:name="_Toc25148324"/>
-      <w:bookmarkStart w:id="51" w:name="_Toc63926724"/>
+      <w:bookmarkStart w:id="51" w:name="_Toc110858282"/>
       <w:r>
         <w:t>Funktional</w:t>
       </w:r>
@@ -14299,7 +14302,6 @@
           </w:tcPr>
           <w:p>
             <w:r>
-              <w:lastRenderedPageBreak/>
               <w:t>Endzustand</w:t>
             </w:r>
           </w:p>
@@ -14382,7 +14384,7 @@
         <w:pStyle w:val="berschrift3"/>
       </w:pPr>
       <w:bookmarkStart w:id="52" w:name="_Toc25148325"/>
-      <w:bookmarkStart w:id="53" w:name="_Toc63926725"/>
+      <w:bookmarkStart w:id="53" w:name="_Toc110858283"/>
       <w:r>
         <w:t>Nicht-Funktional</w:t>
       </w:r>
@@ -14402,7 +14404,7 @@
         <w:pStyle w:val="berschrift2"/>
       </w:pPr>
       <w:bookmarkStart w:id="54" w:name="_Toc25148326"/>
-      <w:bookmarkStart w:id="55" w:name="_Toc63926726"/>
+      <w:bookmarkStart w:id="55" w:name="_Toc110858284"/>
       <w:r>
         <w:t>Ziele</w:t>
       </w:r>
@@ -14414,7 +14416,7 @@
         <w:pStyle w:val="berschrift3"/>
       </w:pPr>
       <w:bookmarkStart w:id="56" w:name="_Toc25148327"/>
-      <w:bookmarkStart w:id="57" w:name="_Toc63926727"/>
+      <w:bookmarkStart w:id="57" w:name="_Toc110858285"/>
       <w:r>
         <w:t>Soll-System</w:t>
       </w:r>
@@ -14434,7 +14436,7 @@
         <w:pStyle w:val="berschrift3"/>
       </w:pPr>
       <w:bookmarkStart w:id="58" w:name="_Toc25148328"/>
-      <w:bookmarkStart w:id="59" w:name="_Toc63926728"/>
+      <w:bookmarkStart w:id="59" w:name="_Toc110858286"/>
       <w:r>
         <w:t>Erforderlich</w:t>
       </w:r>
@@ -14454,7 +14456,7 @@
         <w:pStyle w:val="berschrift3"/>
       </w:pPr>
       <w:bookmarkStart w:id="60" w:name="_Toc25148329"/>
-      <w:bookmarkStart w:id="61" w:name="_Toc63926729"/>
+      <w:bookmarkStart w:id="61" w:name="_Toc110858287"/>
       <w:r>
         <w:t>Optional</w:t>
       </w:r>
@@ -14475,7 +14477,7 @@
         <w:pStyle w:val="berschrift2"/>
       </w:pPr>
       <w:bookmarkStart w:id="62" w:name="_Toc25148330"/>
-      <w:bookmarkStart w:id="63" w:name="_Toc63926730"/>
+      <w:bookmarkStart w:id="63" w:name="_Toc110858288"/>
       <w:r>
         <w:t>Risiken</w:t>
       </w:r>
@@ -14596,7 +14598,7 @@
         <w:pStyle w:val="berschrift2"/>
       </w:pPr>
       <w:bookmarkStart w:id="64" w:name="_Toc25148331"/>
-      <w:bookmarkStart w:id="65" w:name="_Toc63926731"/>
+      <w:bookmarkStart w:id="65" w:name="_Toc110858289"/>
       <w:r>
         <w:t>Lösungsvarianten</w:t>
       </w:r>
@@ -14616,7 +14618,7 @@
         <w:pStyle w:val="berschrift1"/>
       </w:pPr>
       <w:bookmarkStart w:id="66" w:name="_Toc25148332"/>
-      <w:bookmarkStart w:id="67" w:name="_Toc63926732"/>
+      <w:bookmarkStart w:id="67" w:name="_Toc110858290"/>
       <w:r>
         <w:lastRenderedPageBreak/>
         <w:t>Entwurf</w:t>
@@ -14629,7 +14631,7 @@
         <w:pStyle w:val="berschrift2"/>
       </w:pPr>
       <w:bookmarkStart w:id="68" w:name="_Toc25148333"/>
-      <w:bookmarkStart w:id="69" w:name="_Toc63926733"/>
+      <w:bookmarkStart w:id="69" w:name="_Toc110858291"/>
       <w:r>
         <w:t>Systembeschreibung</w:t>
       </w:r>
@@ -14641,7 +14643,7 @@
         <w:pStyle w:val="berschrift3"/>
       </w:pPr>
       <w:bookmarkStart w:id="70" w:name="_Toc25148334"/>
-      <w:bookmarkStart w:id="71" w:name="_Toc63926734"/>
+      <w:bookmarkStart w:id="71" w:name="_Toc110858292"/>
       <w:r>
         <w:t>Technologien</w:t>
       </w:r>
@@ -14658,7 +14660,7 @@
       <w:r>
         <w:t xml:space="preserve">Für die Applikation wurde die Sprache XY benutz. Für die Versionskontrolle wurde ein Firmen Internes Git Repository verwendet. Das Backup des Servers wird nach dem </w:t>
       </w:r>
-      <w:hyperlink r:id="rId20" w:history="1">
+      <w:hyperlink r:id="rId21" w:history="1">
         <w:r>
           <w:rPr>
             <w:rStyle w:val="Hyperlink"/>
@@ -14791,7 +14793,7 @@
         <w:pStyle w:val="berschrift3"/>
       </w:pPr>
       <w:bookmarkStart w:id="72" w:name="_Toc25148335"/>
-      <w:bookmarkStart w:id="73" w:name="_Toc63926735"/>
+      <w:bookmarkStart w:id="73" w:name="_Toc110858293"/>
       <w:r>
         <w:t>Architektur</w:t>
       </w:r>
@@ -14811,7 +14813,7 @@
         <w:pStyle w:val="berschrift3"/>
       </w:pPr>
       <w:bookmarkStart w:id="74" w:name="_Toc25148336"/>
-      <w:bookmarkStart w:id="75" w:name="_Toc63926736"/>
+      <w:bookmarkStart w:id="75" w:name="_Toc110858294"/>
       <w:r>
         <w:t>Projektumfeld</w:t>
       </w:r>
@@ -14971,7 +14973,7 @@
         <w:pStyle w:val="berschrift2"/>
       </w:pPr>
       <w:bookmarkStart w:id="76" w:name="_Toc25148337"/>
-      <w:bookmarkStart w:id="77" w:name="_Toc63926737"/>
+      <w:bookmarkStart w:id="77" w:name="_Toc110858295"/>
       <w:r>
         <w:t>Design</w:t>
       </w:r>
@@ -14983,7 +14985,7 @@
         <w:pStyle w:val="berschrift3"/>
       </w:pPr>
       <w:bookmarkStart w:id="78" w:name="_Toc25148338"/>
-      <w:bookmarkStart w:id="79" w:name="_Toc63926738"/>
+      <w:bookmarkStart w:id="79" w:name="_Toc110858296"/>
       <w:r>
         <w:t>Activity</w:t>
       </w:r>
@@ -14995,7 +14997,7 @@
         <w:pStyle w:val="berschrift3"/>
       </w:pPr>
       <w:bookmarkStart w:id="80" w:name="_Toc25148340"/>
-      <w:bookmarkStart w:id="81" w:name="_Toc63926740"/>
+      <w:bookmarkStart w:id="81" w:name="_Toc110858297"/>
       <w:r>
         <w:t>ERM</w:t>
       </w:r>
@@ -15007,7 +15009,7 @@
         <w:pStyle w:val="berschrift3"/>
       </w:pPr>
       <w:bookmarkStart w:id="82" w:name="_Toc25148341"/>
-      <w:bookmarkStart w:id="83" w:name="_Toc63926741"/>
+      <w:bookmarkStart w:id="83" w:name="_Toc110858298"/>
       <w:r>
         <w:t>Klassendiagramm</w:t>
       </w:r>
@@ -15019,7 +15021,7 @@
         <w:pStyle w:val="berschrift3"/>
       </w:pPr>
       <w:bookmarkStart w:id="84" w:name="_Toc25148342"/>
-      <w:bookmarkStart w:id="85" w:name="_Toc63926742"/>
+      <w:bookmarkStart w:id="85" w:name="_Toc110858299"/>
       <w:r>
         <w:t>Mock-Ups</w:t>
       </w:r>
@@ -15031,7 +15033,7 @@
         <w:pStyle w:val="berschrift3"/>
       </w:pPr>
       <w:bookmarkStart w:id="86" w:name="_Toc25148343"/>
-      <w:bookmarkStart w:id="87" w:name="_Toc63926743"/>
+      <w:bookmarkStart w:id="87" w:name="_Toc110858300"/>
       <w:r>
         <w:t>Struktogramm</w:t>
       </w:r>
@@ -15043,7 +15045,7 @@
         <w:pStyle w:val="berschrift3"/>
       </w:pPr>
       <w:bookmarkStart w:id="88" w:name="_Toc25148344"/>
-      <w:bookmarkStart w:id="89" w:name="_Toc63926744"/>
+      <w:bookmarkStart w:id="89" w:name="_Toc110858301"/>
       <w:r>
         <w:t>…?</w:t>
       </w:r>
@@ -15054,19 +15056,19 @@
       <w:pPr>
         <w:pStyle w:val="berschrift1"/>
       </w:pPr>
-      <w:bookmarkStart w:id="90" w:name="_Toc63926745"/>
-      <w:bookmarkStart w:id="91" w:name="_Toc25148348"/>
+      <w:bookmarkStart w:id="90" w:name="_Toc25148348"/>
+      <w:bookmarkStart w:id="91" w:name="_Toc110858302"/>
       <w:r>
         <w:lastRenderedPageBreak/>
         <w:t>Entscheiden</w:t>
       </w:r>
-      <w:bookmarkEnd w:id="90"/>
+      <w:bookmarkEnd w:id="91"/>
     </w:p>
     <w:p>
       <w:pPr>
         <w:pStyle w:val="berschrift1"/>
       </w:pPr>
-      <w:bookmarkStart w:id="92" w:name="_Toc63926746"/>
+      <w:bookmarkStart w:id="92" w:name="_Toc110858303"/>
       <w:r>
         <w:lastRenderedPageBreak/>
         <w:t>Realisierung</w:t>
@@ -15077,12 +15079,12 @@
       <w:pPr>
         <w:pStyle w:val="berschrift1"/>
       </w:pPr>
-      <w:bookmarkStart w:id="93" w:name="_Toc63926747"/>
+      <w:bookmarkStart w:id="93" w:name="_Toc110858304"/>
       <w:r>
         <w:lastRenderedPageBreak/>
         <w:t>Testplan</w:t>
       </w:r>
-      <w:bookmarkEnd w:id="91"/>
+      <w:bookmarkEnd w:id="90"/>
       <w:bookmarkEnd w:id="93"/>
     </w:p>
     <w:p>
@@ -15090,7 +15092,7 @@
         <w:pStyle w:val="berschrift2"/>
       </w:pPr>
       <w:bookmarkStart w:id="94" w:name="_Toc25148349"/>
-      <w:bookmarkStart w:id="95" w:name="_Toc63926748"/>
+      <w:bookmarkStart w:id="95" w:name="_Toc110858305"/>
       <w:r>
         <w:t>Testmethode</w:t>
       </w:r>
@@ -15110,7 +15112,7 @@
         <w:pStyle w:val="berschrift2"/>
       </w:pPr>
       <w:bookmarkStart w:id="96" w:name="_Toc25148350"/>
-      <w:bookmarkStart w:id="97" w:name="_Toc63926749"/>
+      <w:bookmarkStart w:id="97" w:name="_Toc110858306"/>
       <w:r>
         <w:t>Voraussetzungen</w:t>
       </w:r>
@@ -15265,7 +15267,7 @@
         <w:pStyle w:val="berschrift2"/>
       </w:pPr>
       <w:bookmarkStart w:id="98" w:name="_Toc25148351"/>
-      <w:bookmarkStart w:id="99" w:name="_Toc63926750"/>
+      <w:bookmarkStart w:id="99" w:name="_Toc110858307"/>
       <w:r>
         <w:t>Testfälle</w:t>
       </w:r>
@@ -15526,7 +15528,7 @@
         <w:pStyle w:val="berschrift2"/>
       </w:pPr>
       <w:bookmarkStart w:id="100" w:name="_Toc25148352"/>
-      <w:bookmarkStart w:id="101" w:name="_Toc63926751"/>
+      <w:bookmarkStart w:id="101" w:name="_Toc110858308"/>
       <w:r>
         <w:t>Testbericht</w:t>
       </w:r>
@@ -15547,7 +15549,7 @@
         <w:pStyle w:val="berschrift1"/>
       </w:pPr>
       <w:bookmarkStart w:id="102" w:name="_Toc25148353"/>
-      <w:bookmarkStart w:id="103" w:name="_Toc63926752"/>
+      <w:bookmarkStart w:id="103" w:name="_Toc110858309"/>
       <w:r>
         <w:lastRenderedPageBreak/>
         <w:t>Benutzeranleitung</w:t>
@@ -15560,7 +15562,7 @@
         <w:pStyle w:val="berschrift2"/>
       </w:pPr>
       <w:bookmarkStart w:id="104" w:name="_Toc25148354"/>
-      <w:bookmarkStart w:id="105" w:name="_Toc63926753"/>
+      <w:bookmarkStart w:id="105" w:name="_Toc110858310"/>
       <w:r>
         <w:t>Systemeinstellungen</w:t>
       </w:r>
@@ -15580,7 +15582,7 @@
         <w:pStyle w:val="berschrift2"/>
       </w:pPr>
       <w:bookmarkStart w:id="106" w:name="_Toc25148355"/>
-      <w:bookmarkStart w:id="107" w:name="_Toc63926754"/>
+      <w:bookmarkStart w:id="107" w:name="_Toc110858311"/>
       <w:r>
         <w:t>Installationsanleitung</w:t>
       </w:r>
@@ -15600,7 +15602,7 @@
         <w:pStyle w:val="berschrift2"/>
       </w:pPr>
       <w:bookmarkStart w:id="108" w:name="_Toc25148356"/>
-      <w:bookmarkStart w:id="109" w:name="_Toc63926755"/>
+      <w:bookmarkStart w:id="109" w:name="_Toc110858312"/>
       <w:r>
         <w:t>Bedienungsanleitung</w:t>
       </w:r>
@@ -15621,7 +15623,7 @@
         <w:pStyle w:val="berschrift1"/>
       </w:pPr>
       <w:bookmarkStart w:id="110" w:name="_Toc25148357"/>
-      <w:bookmarkStart w:id="111" w:name="_Toc63926756"/>
+      <w:bookmarkStart w:id="111" w:name="_Toc110858313"/>
       <w:r>
         <w:lastRenderedPageBreak/>
         <w:t>Probleme</w:t>
@@ -15745,7 +15747,7 @@
         <w:pStyle w:val="berschrift1"/>
       </w:pPr>
       <w:bookmarkStart w:id="112" w:name="_Toc25148358"/>
-      <w:bookmarkStart w:id="113" w:name="_Toc63926757"/>
+      <w:bookmarkStart w:id="113" w:name="_Toc110858314"/>
       <w:r>
         <w:lastRenderedPageBreak/>
         <w:t>Schlusswort</w:t>
@@ -15808,7 +15810,7 @@
       <w:pPr>
         <w:pStyle w:val="berschrift1"/>
       </w:pPr>
-      <w:bookmarkStart w:id="114" w:name="_Toc63926758"/>
+      <w:bookmarkStart w:id="114" w:name="_Toc110858315"/>
       <w:r>
         <w:lastRenderedPageBreak/>
         <w:t>Verzeichnisse</w:t>
@@ -15820,7 +15822,7 @@
       <w:pPr>
         <w:pStyle w:val="berschrift2"/>
       </w:pPr>
-      <w:bookmarkStart w:id="115" w:name="_Toc63926759"/>
+      <w:bookmarkStart w:id="115" w:name="_Toc110858316"/>
       <w:r>
         <w:t>Glossar</w:t>
       </w:r>
@@ -16030,7 +16032,7 @@
       <w:pPr>
         <w:pStyle w:val="berschrift2"/>
       </w:pPr>
-      <w:bookmarkStart w:id="116" w:name="_Toc63926760"/>
+      <w:bookmarkStart w:id="116" w:name="_Toc110858317"/>
       <w:r>
         <w:t>Quellenverzeichnis</w:t>
       </w:r>
@@ -16040,7 +16042,7 @@
       <w:pPr>
         <w:pStyle w:val="berschrift3"/>
       </w:pPr>
-      <w:bookmarkStart w:id="117" w:name="_Toc63926761"/>
+      <w:bookmarkStart w:id="117" w:name="_Toc110858318"/>
       <w:r>
         <w:t>Sitzungsprotokolle</w:t>
       </w:r>
@@ -16058,7 +16060,7 @@
       <w:pPr>
         <w:pStyle w:val="berschrift2"/>
       </w:pPr>
-      <w:bookmarkStart w:id="118" w:name="_Toc63926762"/>
+      <w:bookmarkStart w:id="118" w:name="_Toc110858319"/>
       <w:r>
         <w:t>Bildverzeichnis</w:t>
       </w:r>
@@ -16109,8 +16111,8 @@
         <w:spacing w:after="160" w:line="259" w:lineRule="auto"/>
         <w:ind w:left="709" w:hanging="709"/>
         <w:sectPr>
-          <w:headerReference w:type="default" r:id="rId21"/>
-          <w:footerReference w:type="default" r:id="rId22"/>
+          <w:headerReference w:type="default" r:id="rId22"/>
+          <w:footerReference w:type="default" r:id="rId23"/>
           <w:pgSz w:w="11906" w:h="16838" w:code="9"/>
           <w:pgMar w:top="1985" w:right="851" w:bottom="1531" w:left="1418" w:header="709" w:footer="244" w:gutter="0"/>
           <w:cols w:space="708"/>
@@ -16129,7 +16131,7 @@
         <w:spacing w:after="160" w:line="259" w:lineRule="auto"/>
         <w:ind w:left="709" w:hanging="709"/>
       </w:pPr>
-      <w:bookmarkStart w:id="120" w:name="_Toc63926763"/>
+      <w:bookmarkStart w:id="120" w:name="_Toc110858320"/>
       <w:r>
         <w:lastRenderedPageBreak/>
         <w:t>Anhänge</w:t>
@@ -16340,7 +16342,7 @@
         <w:pStyle w:val="K-Anh2"/>
       </w:pPr>
       <w:bookmarkStart w:id="122" w:name="_Toc63925768"/>
-      <w:bookmarkStart w:id="123" w:name="_Toc63926764"/>
+      <w:bookmarkStart w:id="123" w:name="_Toc110858321"/>
       <w:r>
         <w:t>Anhang 1: Listings</w:t>
       </w:r>
@@ -16384,7 +16386,7 @@
       </w:pPr>
       <w:bookmarkStart w:id="124" w:name="_Toc25148363"/>
       <w:bookmarkStart w:id="125" w:name="_Toc63925769"/>
-      <w:bookmarkStart w:id="126" w:name="_Toc63926765"/>
+      <w:bookmarkStart w:id="126" w:name="_Toc110858322"/>
       <w:r>
         <w:t>Anhang</w:t>
       </w:r>
@@ -16411,7 +16413,7 @@
       </w:pPr>
     </w:p>
     <w:sectPr>
-      <w:footerReference w:type="default" r:id="rId23"/>
+      <w:footerReference w:type="default" r:id="rId24"/>
       <w:pgSz w:w="11906" w:h="16838" w:code="9"/>
       <w:pgMar w:top="1985" w:right="851" w:bottom="1531" w:left="1418" w:header="709" w:footer="244" w:gutter="0"/>
       <w:pgNumType w:fmt="upperRoman" w:start="1"/>
@@ -21506,6 +21508,25 @@
       <w:szCs w:val="26"/>
     </w:rPr>
   </w:style>
+  <w:style w:type="paragraph" w:styleId="Beschriftung">
+    <w:name w:val="caption"/>
+    <w:basedOn w:val="Standard"/>
+    <w:next w:val="Standard"/>
+    <w:uiPriority w:val="35"/>
+    <w:unhideWhenUsed/>
+    <w:qFormat/>
+    <w:rsid w:val="00C32AEA"/>
+    <w:pPr>
+      <w:spacing w:after="200"/>
+    </w:pPr>
+    <w:rPr>
+      <w:i/>
+      <w:iCs/>
+      <w:color w:val="44546A" w:themeColor="text2"/>
+      <w:sz w:val="18"/>
+      <w:szCs w:val="18"/>
+    </w:rPr>
+  </w:style>
 </w:styles>
 </file>
 
@@ -21824,6 +21845,7 @@
     <w:rsidRoot w:val="002A790C"/>
     <w:rsid w:val="00075B9D"/>
     <w:rsid w:val="00155468"/>
+    <w:rsid w:val="00187613"/>
     <w:rsid w:val="00294465"/>
     <w:rsid w:val="002A790C"/>
     <w:rsid w:val="002C6637"/>
@@ -21834,11 +21856,11 @@
     <w:rsid w:val="00962AB4"/>
     <w:rsid w:val="009A34D4"/>
     <w:rsid w:val="00A32E5C"/>
-    <w:rsid w:val="00AD79BD"/>
     <w:rsid w:val="00BD1F16"/>
     <w:rsid w:val="00C62BDB"/>
     <w:rsid w:val="00C64852"/>
     <w:rsid w:val="00D01ED4"/>
+    <w:rsid w:val="00D55047"/>
     <w:rsid w:val="00D95FBC"/>
     <w:rsid w:val="00E44AEE"/>
     <w:rsid w:val="00FF5032"/>

</xml_diff>